<commit_message>
Add GTM activity plan and execution template
Edition 1.1 adds 17 fictional activities with owners, work windows, dependencies and completion criteria, plus a reusable activity record and execution field in the launch brief.
</commit_message>
<xml_diff>
--- a/practical-gtm-template.docx
+++ b/practical-gtm-template.docx
@@ -25,7 +25,7 @@
         <w:widowControl/>
       </w:pPr>
       <w:r>
-        <w:t>Sandeep Singh Rajput  |  First edition  October 2026</w:t>
+        <w:t>Sandeep Singh Rajput  |  Edition 1.1  October 2026</w:t>
       </w:r>
     </w:p>
     <w:p>
@@ -41,7 +41,7 @@
         <w:widowControl/>
       </w:pPr>
       <w:r>
-        <w:t>Use this workbook to make the commercial and product decisions behind a launch. Work from a specific customer problem through the offer, buying process, first value and rollout. The final output is a one page GTM brief supported by evidence, owners and explicit launch gates.</w:t>
+        <w:t>Use this workbook to make the commercial and product decisions behind a launch, then turn those decisions into an activity plan. Work from a specific customer problem through the offer, buying process, first value and rollout. The outputs are an execution plan and a one page GTM brief supported by evidence, owners and explicit launch gates.</w:t>
       </w:r>
     </w:p>
     <w:p>
@@ -7910,7 +7910,3539 @@
         <w:pStyle w:val="Heading1"/>
       </w:pPr>
       <w:r>
-        <w:t>13 One page GTM brief</w:t>
+        <w:t>13 GTM activities and execution plan</w:t>
+      </w:r>
+    </w:p>
+    <w:p>
+      <w:pPr>
+        <w:widowControl/>
+      </w:pPr>
+      <w:r>
+        <w:t>Translate the choices in Sections 1 to 12 into work that someone can deliver. Plan customer validation, product marketing assets, demand generation, sales and partner preparation, onboarding and commercial follow up. For every activity, specify the customer or internal audience, the output, one accountable owner, a due date, dependencies, effort or budget, and evidence of completion.</w:t>
+      </w:r>
+    </w:p>
+    <w:p>
+      <w:pPr>
+        <w:widowControl/>
+      </w:pPr>
+      <w:r>
+        <w:t>Work backward from the next release gate. Start with activities that resolve a critical uncertainty or unblock the buying path. A webinar needs an accurate offer, a demonstrated workflow, a tested registration route and capacity to handle qualified evaluations. Delay promotion when those dependencies are unresolved. Use separate owners for approval and execution when needed.</w:t>
+      </w:r>
+    </w:p>
+    <w:p>
+      <w:pPr>
+        <w:widowControl/>
+      </w:pPr>
+      <w:r>
+        <w:t>The following plan applies to the fictional vendor intake product. Day 1 is the start of its 90 day planning period; the ranges are illustrative work windows, not promised launch dates. Move a dependent activity when a gate slips. The initial acquisition test is one focused webinar with targeted invitations and follow up. Paid acquisition and a broad partner campaign are deferred until adoption and delivery economics justify them.</w:t>
+      </w:r>
+    </w:p>
+    <w:p>
+      <w:pPr>
+        <w:pStyle w:val="Heading2"/>
+      </w:pPr>
+      <w:r>
+        <w:t>Plan the work</w:t>
+      </w:r>
+    </w:p>
+    <w:tbl>
+      <w:tblPr>
+        <w:tblW w:type="auto" w:w="0"/>
+        <w:jc w:val="center"/>
+        <w:tblLayout w:type="fixed"/>
+        <w:tblLook w:firstColumn="1" w:firstRow="1" w:lastColumn="0" w:lastRow="0" w:noHBand="0" w:noVBand="1" w:val="04A0"/>
+      </w:tblPr>
+      <w:tblGrid>
+        <w:gridCol w:w="2448"/>
+        <w:gridCol w:w="7445"/>
+      </w:tblGrid>
+      <w:tr>
+        <w:trPr>
+          <w:cantSplit/>
+          <w:tblHeader/>
+        </w:trPr>
+        <w:tc>
+          <w:tcPr>
+            <w:tcW w:type="dxa" w:w="2448"/>
+            <w:vAlign w:val="center"/>
+            <w:tcBorders>
+              <w:top w:val="single" w:sz="4" w:color="D9D9D9"/>
+              <w:left w:val="single" w:sz="4" w:color="D9D9D9"/>
+              <w:bottom w:val="single" w:sz="4" w:color="D9D9D9"/>
+              <w:right w:val="single" w:sz="4" w:color="D9D9D9"/>
+            </w:tcBorders>
+            <w:tcMar>
+              <w:top w:w="90" w:type="dxa"/>
+              <w:bottom w:w="90" w:type="dxa"/>
+              <w:left w:w="110" w:type="dxa"/>
+              <w:right w:w="110" w:type="dxa"/>
+            </w:tcMar>
+            <w:shd w:fill="153C52"/>
+          </w:tcPr>
+          <w:p>
+            <w:pPr>
+              <w:spacing w:after="60" w:line="252" w:lineRule="auto"/>
+            </w:pPr>
+            <w:r>
+              <w:rPr>
+                <w:b/>
+                <w:color w:val="FFFFFF"/>
+                <w:sz w:val="20"/>
+              </w:rPr>
+              <w:t>Decision</w:t>
+            </w:r>
+          </w:p>
+        </w:tc>
+        <w:tc>
+          <w:tcPr>
+            <w:tcW w:type="dxa" w:w="7445"/>
+            <w:vAlign w:val="center"/>
+            <w:tcBorders>
+              <w:top w:val="single" w:sz="4" w:color="D9D9D9"/>
+              <w:left w:val="single" w:sz="4" w:color="D9D9D9"/>
+              <w:bottom w:val="single" w:sz="4" w:color="D9D9D9"/>
+              <w:right w:val="single" w:sz="4" w:color="D9D9D9"/>
+            </w:tcBorders>
+            <w:tcMar>
+              <w:top w:w="90" w:type="dxa"/>
+              <w:bottom w:w="90" w:type="dxa"/>
+              <w:left w:w="110" w:type="dxa"/>
+              <w:right w:w="110" w:type="dxa"/>
+            </w:tcMar>
+            <w:shd w:fill="153C52"/>
+          </w:tcPr>
+          <w:p>
+            <w:pPr>
+              <w:spacing w:after="60" w:line="252" w:lineRule="auto"/>
+            </w:pPr>
+            <w:r>
+              <w:rPr>
+                <w:b/>
+                <w:color w:val="FFFFFF"/>
+                <w:sz w:val="20"/>
+              </w:rPr>
+              <w:t>Your answer and evidence</w:t>
+            </w:r>
+          </w:p>
+        </w:tc>
+      </w:tr>
+      <w:tr>
+        <w:trPr>
+          <w:cantSplit/>
+        </w:trPr>
+        <w:tc>
+          <w:tcPr>
+            <w:tcW w:type="dxa" w:w="2448"/>
+            <w:vAlign w:val="center"/>
+            <w:tcBorders>
+              <w:top w:val="single" w:sz="4" w:color="D9D9D9"/>
+              <w:left w:val="single" w:sz="4" w:color="D9D9D9"/>
+              <w:bottom w:val="single" w:sz="4" w:color="D9D9D9"/>
+              <w:right w:val="single" w:sz="4" w:color="D9D9D9"/>
+            </w:tcBorders>
+            <w:tcMar>
+              <w:top w:w="90" w:type="dxa"/>
+              <w:bottom w:w="90" w:type="dxa"/>
+              <w:left w:w="110" w:type="dxa"/>
+              <w:right w:w="110" w:type="dxa"/>
+            </w:tcMar>
+            <w:shd w:fill="F1F6F8"/>
+          </w:tcPr>
+          <w:p>
+            <w:pPr>
+              <w:spacing w:after="60" w:line="252" w:lineRule="auto"/>
+            </w:pPr>
+            <w:r>
+              <w:rPr>
+                <w:b/>
+                <w:sz w:val="20"/>
+              </w:rPr>
+              <w:t>Next gate and audience</w:t>
+            </w:r>
+          </w:p>
+        </w:tc>
+        <w:tc>
+          <w:tcPr>
+            <w:tcW w:type="dxa" w:w="7445"/>
+            <w:vAlign w:val="center"/>
+            <w:tcBorders>
+              <w:top w:val="single" w:sz="4" w:color="D9D9D9"/>
+              <w:left w:val="single" w:sz="4" w:color="D9D9D9"/>
+              <w:bottom w:val="single" w:sz="4" w:color="D9D9D9"/>
+              <w:right w:val="single" w:sz="4" w:color="D9D9D9"/>
+            </w:tcBorders>
+            <w:tcMar>
+              <w:top w:w="90" w:type="dxa"/>
+              <w:bottom w:w="90" w:type="dxa"/>
+              <w:left w:w="110" w:type="dxa"/>
+              <w:right w:w="110" w:type="dxa"/>
+            </w:tcMar>
+            <w:shd w:fill="F1F6F8"/>
+          </w:tcPr>
+          <w:p>
+            <w:pPr>
+              <w:spacing w:after="60" w:line="252" w:lineRule="auto"/>
+            </w:pPr>
+            <w:r>
+              <w:rPr>
+                <w:i/>
+                <w:color w:val="52616B"/>
+                <w:sz w:val="20"/>
+              </w:rPr>
+              <w:t>[Gate to reach, eligible customer segment and exact evaluation offer.]</w:t>
+            </w:r>
+            <w:r>
+              <w:rPr>
+                <w:i w:val="0"/>
+                <w:color w:val="20252B"/>
+                <w:sz w:val="20"/>
+              </w:rPr>
+              <w:br/>
+              <w:t xml:space="preserve">Your response: </w:t>
+            </w:r>
+          </w:p>
+        </w:tc>
+      </w:tr>
+      <w:tr>
+        <w:trPr>
+          <w:cantSplit/>
+        </w:trPr>
+        <w:tc>
+          <w:tcPr>
+            <w:tcW w:type="dxa" w:w="2448"/>
+            <w:vAlign w:val="center"/>
+            <w:tcBorders>
+              <w:top w:val="single" w:sz="4" w:color="D9D9D9"/>
+              <w:left w:val="single" w:sz="4" w:color="D9D9D9"/>
+              <w:bottom w:val="single" w:sz="4" w:color="D9D9D9"/>
+              <w:right w:val="single" w:sz="4" w:color="D9D9D9"/>
+            </w:tcBorders>
+            <w:tcMar>
+              <w:top w:w="90" w:type="dxa"/>
+              <w:bottom w:w="90" w:type="dxa"/>
+              <w:left w:w="110" w:type="dxa"/>
+              <w:right w:w="110" w:type="dxa"/>
+            </w:tcMar>
+            <w:shd w:fill="FFFFFF"/>
+          </w:tcPr>
+          <w:p>
+            <w:pPr>
+              <w:spacing w:after="60" w:line="252" w:lineRule="auto"/>
+            </w:pPr>
+            <w:r>
+              <w:rPr>
+                <w:b/>
+                <w:sz w:val="20"/>
+              </w:rPr>
+              <w:t>Work to produce</w:t>
+            </w:r>
+          </w:p>
+        </w:tc>
+        <w:tc>
+          <w:tcPr>
+            <w:tcW w:type="dxa" w:w="7445"/>
+            <w:vAlign w:val="center"/>
+            <w:tcBorders>
+              <w:top w:val="single" w:sz="4" w:color="D9D9D9"/>
+              <w:left w:val="single" w:sz="4" w:color="D9D9D9"/>
+              <w:bottom w:val="single" w:sz="4" w:color="D9D9D9"/>
+              <w:right w:val="single" w:sz="4" w:color="D9D9D9"/>
+            </w:tcBorders>
+            <w:tcMar>
+              <w:top w:w="90" w:type="dxa"/>
+              <w:bottom w:w="90" w:type="dxa"/>
+              <w:left w:w="110" w:type="dxa"/>
+              <w:right w:w="110" w:type="dxa"/>
+            </w:tcMar>
+            <w:shd w:fill="FFFFFF"/>
+          </w:tcPr>
+          <w:p>
+            <w:pPr>
+              <w:spacing w:after="60" w:line="252" w:lineRule="auto"/>
+            </w:pPr>
+            <w:r>
+              <w:rPr>
+                <w:i/>
+                <w:color w:val="52616B"/>
+                <w:sz w:val="20"/>
+              </w:rPr>
+              <w:t>[Required evidence, customer facing assets, internal enablement and onboarding tasks; link each to its decision section.]</w:t>
+            </w:r>
+            <w:r>
+              <w:rPr>
+                <w:i w:val="0"/>
+                <w:color w:val="20252B"/>
+                <w:sz w:val="20"/>
+              </w:rPr>
+              <w:br/>
+              <w:t xml:space="preserve">Your response: </w:t>
+            </w:r>
+          </w:p>
+        </w:tc>
+      </w:tr>
+      <w:tr>
+        <w:trPr>
+          <w:cantSplit/>
+        </w:trPr>
+        <w:tc>
+          <w:tcPr>
+            <w:tcW w:type="dxa" w:w="2448"/>
+            <w:vAlign w:val="center"/>
+            <w:tcBorders>
+              <w:top w:val="single" w:sz="4" w:color="D9D9D9"/>
+              <w:left w:val="single" w:sz="4" w:color="D9D9D9"/>
+              <w:bottom w:val="single" w:sz="4" w:color="D9D9D9"/>
+              <w:right w:val="single" w:sz="4" w:color="D9D9D9"/>
+            </w:tcBorders>
+            <w:tcMar>
+              <w:top w:w="90" w:type="dxa"/>
+              <w:bottom w:w="90" w:type="dxa"/>
+              <w:left w:w="110" w:type="dxa"/>
+              <w:right w:w="110" w:type="dxa"/>
+            </w:tcMar>
+            <w:shd w:fill="F1F6F8"/>
+          </w:tcPr>
+          <w:p>
+            <w:pPr>
+              <w:spacing w:after="60" w:line="252" w:lineRule="auto"/>
+            </w:pPr>
+            <w:r>
+              <w:rPr>
+                <w:b/>
+                <w:sz w:val="20"/>
+              </w:rPr>
+              <w:t>Owners and approvals</w:t>
+            </w:r>
+          </w:p>
+        </w:tc>
+        <w:tc>
+          <w:tcPr>
+            <w:tcW w:type="dxa" w:w="7445"/>
+            <w:vAlign w:val="center"/>
+            <w:tcBorders>
+              <w:top w:val="single" w:sz="4" w:color="D9D9D9"/>
+              <w:left w:val="single" w:sz="4" w:color="D9D9D9"/>
+              <w:bottom w:val="single" w:sz="4" w:color="D9D9D9"/>
+              <w:right w:val="single" w:sz="4" w:color="D9D9D9"/>
+            </w:tcBorders>
+            <w:tcMar>
+              <w:top w:w="90" w:type="dxa"/>
+              <w:bottom w:w="90" w:type="dxa"/>
+              <w:left w:w="110" w:type="dxa"/>
+              <w:right w:w="110" w:type="dxa"/>
+            </w:tcMar>
+            <w:shd w:fill="F1F6F8"/>
+          </w:tcPr>
+          <w:p>
+            <w:pPr>
+              <w:spacing w:after="60" w:line="252" w:lineRule="auto"/>
+            </w:pPr>
+            <w:r>
+              <w:rPr>
+                <w:i/>
+                <w:color w:val="52616B"/>
+                <w:sz w:val="20"/>
+              </w:rPr>
+              <w:t>[One accountable owner per activity, contributors and who approves the output.]</w:t>
+            </w:r>
+            <w:r>
+              <w:rPr>
+                <w:i w:val="0"/>
+                <w:color w:val="20252B"/>
+                <w:sz w:val="20"/>
+              </w:rPr>
+              <w:br/>
+              <w:t xml:space="preserve">Your response: </w:t>
+            </w:r>
+          </w:p>
+        </w:tc>
+      </w:tr>
+      <w:tr>
+        <w:trPr>
+          <w:cantSplit/>
+        </w:trPr>
+        <w:tc>
+          <w:tcPr>
+            <w:tcW w:type="dxa" w:w="2448"/>
+            <w:vAlign w:val="center"/>
+            <w:tcBorders>
+              <w:top w:val="single" w:sz="4" w:color="D9D9D9"/>
+              <w:left w:val="single" w:sz="4" w:color="D9D9D9"/>
+              <w:bottom w:val="single" w:sz="4" w:color="D9D9D9"/>
+              <w:right w:val="single" w:sz="4" w:color="D9D9D9"/>
+            </w:tcBorders>
+            <w:tcMar>
+              <w:top w:w="90" w:type="dxa"/>
+              <w:bottom w:w="90" w:type="dxa"/>
+              <w:left w:w="110" w:type="dxa"/>
+              <w:right w:w="110" w:type="dxa"/>
+            </w:tcMar>
+            <w:shd w:fill="FFFFFF"/>
+          </w:tcPr>
+          <w:p>
+            <w:pPr>
+              <w:spacing w:after="60" w:line="252" w:lineRule="auto"/>
+            </w:pPr>
+            <w:r>
+              <w:rPr>
+                <w:b/>
+                <w:sz w:val="20"/>
+              </w:rPr>
+              <w:t>Sequence and capacity</w:t>
+            </w:r>
+          </w:p>
+        </w:tc>
+        <w:tc>
+          <w:tcPr>
+            <w:tcW w:type="dxa" w:w="7445"/>
+            <w:vAlign w:val="center"/>
+            <w:tcBorders>
+              <w:top w:val="single" w:sz="4" w:color="D9D9D9"/>
+              <w:left w:val="single" w:sz="4" w:color="D9D9D9"/>
+              <w:bottom w:val="single" w:sz="4" w:color="D9D9D9"/>
+              <w:right w:val="single" w:sz="4" w:color="D9D9D9"/>
+            </w:tcBorders>
+            <w:tcMar>
+              <w:top w:w="90" w:type="dxa"/>
+              <w:bottom w:w="90" w:type="dxa"/>
+              <w:left w:w="110" w:type="dxa"/>
+              <w:right w:w="110" w:type="dxa"/>
+            </w:tcMar>
+            <w:shd w:fill="FFFFFF"/>
+          </w:tcPr>
+          <w:p>
+            <w:pPr>
+              <w:spacing w:after="60" w:line="252" w:lineRule="auto"/>
+            </w:pPr>
+            <w:r>
+              <w:rPr>
+                <w:i/>
+                <w:color w:val="52616B"/>
+                <w:sz w:val="20"/>
+              </w:rPr>
+              <w:t>[Dependencies, start and due dates, staff hours, spend cap and available evaluation slots.]</w:t>
+            </w:r>
+            <w:r>
+              <w:rPr>
+                <w:i w:val="0"/>
+                <w:color w:val="20252B"/>
+                <w:sz w:val="20"/>
+              </w:rPr>
+              <w:br/>
+              <w:t xml:space="preserve">Your response: </w:t>
+            </w:r>
+          </w:p>
+        </w:tc>
+      </w:tr>
+      <w:tr>
+        <w:trPr>
+          <w:cantSplit/>
+        </w:trPr>
+        <w:tc>
+          <w:tcPr>
+            <w:tcW w:type="dxa" w:w="2448"/>
+            <w:vAlign w:val="center"/>
+            <w:tcBorders>
+              <w:top w:val="single" w:sz="4" w:color="D9D9D9"/>
+              <w:left w:val="single" w:sz="4" w:color="D9D9D9"/>
+              <w:bottom w:val="single" w:sz="4" w:color="D9D9D9"/>
+              <w:right w:val="single" w:sz="4" w:color="D9D9D9"/>
+            </w:tcBorders>
+            <w:tcMar>
+              <w:top w:w="90" w:type="dxa"/>
+              <w:bottom w:w="90" w:type="dxa"/>
+              <w:left w:w="110" w:type="dxa"/>
+              <w:right w:w="110" w:type="dxa"/>
+            </w:tcMar>
+            <w:shd w:fill="F1F6F8"/>
+          </w:tcPr>
+          <w:p>
+            <w:pPr>
+              <w:spacing w:after="60" w:line="252" w:lineRule="auto"/>
+            </w:pPr>
+            <w:r>
+              <w:rPr>
+                <w:b/>
+                <w:sz w:val="20"/>
+              </w:rPr>
+              <w:t>Completion and outcome</w:t>
+            </w:r>
+          </w:p>
+        </w:tc>
+        <w:tc>
+          <w:tcPr>
+            <w:tcW w:type="dxa" w:w="7445"/>
+            <w:vAlign w:val="center"/>
+            <w:tcBorders>
+              <w:top w:val="single" w:sz="4" w:color="D9D9D9"/>
+              <w:left w:val="single" w:sz="4" w:color="D9D9D9"/>
+              <w:bottom w:val="single" w:sz="4" w:color="D9D9D9"/>
+              <w:right w:val="single" w:sz="4" w:color="D9D9D9"/>
+            </w:tcBorders>
+            <w:tcMar>
+              <w:top w:w="90" w:type="dxa"/>
+              <w:bottom w:w="90" w:type="dxa"/>
+              <w:left w:w="110" w:type="dxa"/>
+              <w:right w:w="110" w:type="dxa"/>
+            </w:tcMar>
+            <w:shd w:fill="F1F6F8"/>
+          </w:tcPr>
+          <w:p>
+            <w:pPr>
+              <w:spacing w:after="60" w:line="252" w:lineRule="auto"/>
+            </w:pPr>
+            <w:r>
+              <w:rPr>
+                <w:i/>
+                <w:color w:val="52616B"/>
+                <w:sz w:val="20"/>
+              </w:rPr>
+              <w:t>[Observable acceptance condition, output link, outcome measure and observation window.]</w:t>
+            </w:r>
+            <w:r>
+              <w:rPr>
+                <w:i w:val="0"/>
+                <w:color w:val="20252B"/>
+                <w:sz w:val="20"/>
+              </w:rPr>
+              <w:br/>
+              <w:t xml:space="preserve">Your response: </w:t>
+            </w:r>
+          </w:p>
+        </w:tc>
+      </w:tr>
+      <w:tr>
+        <w:trPr>
+          <w:cantSplit/>
+        </w:trPr>
+        <w:tc>
+          <w:tcPr>
+            <w:tcW w:type="dxa" w:w="2448"/>
+            <w:vAlign w:val="center"/>
+            <w:tcBorders>
+              <w:top w:val="single" w:sz="4" w:color="D9D9D9"/>
+              <w:left w:val="single" w:sz="4" w:color="D9D9D9"/>
+              <w:bottom w:val="single" w:sz="4" w:color="D9D9D9"/>
+              <w:right w:val="single" w:sz="4" w:color="D9D9D9"/>
+            </w:tcBorders>
+            <w:tcMar>
+              <w:top w:w="90" w:type="dxa"/>
+              <w:bottom w:w="90" w:type="dxa"/>
+              <w:left w:w="110" w:type="dxa"/>
+              <w:right w:w="110" w:type="dxa"/>
+            </w:tcMar>
+            <w:shd w:fill="FFFFFF"/>
+          </w:tcPr>
+          <w:p>
+            <w:pPr>
+              <w:spacing w:after="60" w:line="252" w:lineRule="auto"/>
+            </w:pPr>
+            <w:r>
+              <w:rPr>
+                <w:b/>
+                <w:sz w:val="20"/>
+              </w:rPr>
+              <w:t>Weekly operating review</w:t>
+            </w:r>
+          </w:p>
+        </w:tc>
+        <w:tc>
+          <w:tcPr>
+            <w:tcW w:type="dxa" w:w="7445"/>
+            <w:vAlign w:val="center"/>
+            <w:tcBorders>
+              <w:top w:val="single" w:sz="4" w:color="D9D9D9"/>
+              <w:left w:val="single" w:sz="4" w:color="D9D9D9"/>
+              <w:bottom w:val="single" w:sz="4" w:color="D9D9D9"/>
+              <w:right w:val="single" w:sz="4" w:color="D9D9D9"/>
+            </w:tcBorders>
+            <w:tcMar>
+              <w:top w:w="90" w:type="dxa"/>
+              <w:bottom w:w="90" w:type="dxa"/>
+              <w:left w:w="110" w:type="dxa"/>
+              <w:right w:w="110" w:type="dxa"/>
+            </w:tcMar>
+            <w:shd w:fill="FFFFFF"/>
+          </w:tcPr>
+          <w:p>
+            <w:pPr>
+              <w:spacing w:after="60" w:line="252" w:lineRule="auto"/>
+            </w:pPr>
+            <w:r>
+              <w:rPr>
+                <w:i/>
+                <w:color w:val="52616B"/>
+                <w:sz w:val="20"/>
+              </w:rPr>
+              <w:t>[Review owner and date, blocked work, evidence needed, and whether to continue, revise or stop.]</w:t>
+            </w:r>
+            <w:r>
+              <w:rPr>
+                <w:i w:val="0"/>
+                <w:color w:val="20252B"/>
+                <w:sz w:val="20"/>
+              </w:rPr>
+              <w:br/>
+              <w:t xml:space="preserve">Your response: </w:t>
+            </w:r>
+          </w:p>
+        </w:tc>
+      </w:tr>
+    </w:tbl>
+    <w:p>
+      <w:pPr>
+        <w:widowControl/>
+        <w:spacing w:after="0"/>
+      </w:pPr>
+    </w:p>
+    <w:p>
+      <w:r>
+        <w:br w:type="page"/>
+      </w:r>
+    </w:p>
+    <w:p>
+      <w:pPr>
+        <w:pStyle w:val="Heading1"/>
+      </w:pPr>
+      <w:r>
+        <w:t>Activity plan before launch</w:t>
+      </w:r>
+    </w:p>
+    <w:p>
+      <w:pPr>
+        <w:widowControl/>
+      </w:pPr>
+      <w:r>
+        <w:rPr>
+          <w:b/>
+        </w:rPr>
+        <w:t>Illustrative days 1 to 20</w:t>
+      </w:r>
+    </w:p>
+    <w:p>
+      <w:pPr>
+        <w:widowControl/>
+      </w:pPr>
+      <w:r>
+        <w:t>Establish an offer the chosen segment can evaluate, then prepare the assets and people needed for one acquisition test.</w:t>
+      </w:r>
+    </w:p>
+    <w:p>
+      <w:pPr>
+        <w:widowControl/>
+      </w:pPr>
+      <w:r>
+        <w:t>Worked example only. Owners and timing are proposed roles and work windows for the fictional product. Activities depend on the preceding launch gate.</w:t>
+      </w:r>
+    </w:p>
+    <w:tbl>
+      <w:tblPr>
+        <w:tblW w:type="auto" w:w="0"/>
+        <w:jc w:val="center"/>
+        <w:tblLayout w:type="fixed"/>
+        <w:tblLook w:firstColumn="1" w:firstRow="1" w:lastColumn="0" w:lastRow="0" w:noHBand="0" w:noVBand="1" w:val="04A0"/>
+      </w:tblPr>
+      <w:tblGrid>
+        <w:gridCol w:w="3240"/>
+        <w:gridCol w:w="1872"/>
+        <w:gridCol w:w="4781"/>
+      </w:tblGrid>
+      <w:tr>
+        <w:trPr>
+          <w:cantSplit/>
+          <w:tblHeader/>
+        </w:trPr>
+        <w:tc>
+          <w:tcPr>
+            <w:tcW w:type="dxa" w:w="3240"/>
+            <w:vAlign w:val="center"/>
+            <w:tcBorders>
+              <w:top w:val="single" w:sz="4" w:color="D9D9D9"/>
+              <w:left w:val="single" w:sz="4" w:color="D9D9D9"/>
+              <w:bottom w:val="single" w:sz="4" w:color="D9D9D9"/>
+              <w:right w:val="single" w:sz="4" w:color="D9D9D9"/>
+            </w:tcBorders>
+            <w:tcMar>
+              <w:top w:w="90" w:type="dxa"/>
+              <w:bottom w:w="90" w:type="dxa"/>
+              <w:left w:w="110" w:type="dxa"/>
+              <w:right w:w="110" w:type="dxa"/>
+            </w:tcMar>
+            <w:shd w:fill="153C52"/>
+          </w:tcPr>
+          <w:p>
+            <w:pPr>
+              <w:spacing w:after="60" w:line="252" w:lineRule="auto"/>
+            </w:pPr>
+            <w:r>
+              <w:rPr>
+                <w:b/>
+                <w:color w:val="FFFFFF"/>
+                <w:sz w:val="20"/>
+              </w:rPr>
+              <w:t>Activity and output</w:t>
+            </w:r>
+          </w:p>
+        </w:tc>
+        <w:tc>
+          <w:tcPr>
+            <w:tcW w:type="dxa" w:w="1872"/>
+            <w:vAlign w:val="center"/>
+            <w:tcBorders>
+              <w:top w:val="single" w:sz="4" w:color="D9D9D9"/>
+              <w:left w:val="single" w:sz="4" w:color="D9D9D9"/>
+              <w:bottom w:val="single" w:sz="4" w:color="D9D9D9"/>
+              <w:right w:val="single" w:sz="4" w:color="D9D9D9"/>
+            </w:tcBorders>
+            <w:tcMar>
+              <w:top w:w="90" w:type="dxa"/>
+              <w:bottom w:w="90" w:type="dxa"/>
+              <w:left w:w="110" w:type="dxa"/>
+              <w:right w:w="110" w:type="dxa"/>
+            </w:tcMar>
+            <w:shd w:fill="153C52"/>
+          </w:tcPr>
+          <w:p>
+            <w:pPr>
+              <w:spacing w:after="60" w:line="252" w:lineRule="auto"/>
+            </w:pPr>
+            <w:r>
+              <w:rPr>
+                <w:b/>
+                <w:color w:val="FFFFFF"/>
+                <w:sz w:val="20"/>
+              </w:rPr>
+              <w:t>Owner and timing</w:t>
+            </w:r>
+          </w:p>
+        </w:tc>
+        <w:tc>
+          <w:tcPr>
+            <w:tcW w:type="dxa" w:w="4781"/>
+            <w:vAlign w:val="center"/>
+            <w:tcBorders>
+              <w:top w:val="single" w:sz="4" w:color="D9D9D9"/>
+              <w:left w:val="single" w:sz="4" w:color="D9D9D9"/>
+              <w:bottom w:val="single" w:sz="4" w:color="D9D9D9"/>
+              <w:right w:val="single" w:sz="4" w:color="D9D9D9"/>
+            </w:tcBorders>
+            <w:tcMar>
+              <w:top w:w="90" w:type="dxa"/>
+              <w:bottom w:w="90" w:type="dxa"/>
+              <w:left w:w="110" w:type="dxa"/>
+              <w:right w:w="110" w:type="dxa"/>
+            </w:tcMar>
+            <w:shd w:fill="153C52"/>
+          </w:tcPr>
+          <w:p>
+            <w:pPr>
+              <w:spacing w:after="60" w:line="252" w:lineRule="auto"/>
+            </w:pPr>
+            <w:r>
+              <w:rPr>
+                <w:b/>
+                <w:color w:val="FFFFFF"/>
+                <w:sz w:val="20"/>
+              </w:rPr>
+              <w:t>Dependencies and completion</w:t>
+            </w:r>
+          </w:p>
+        </w:tc>
+      </w:tr>
+      <w:tr>
+        <w:trPr>
+          <w:cantSplit/>
+        </w:trPr>
+        <w:tc>
+          <w:tcPr>
+            <w:tcW w:type="dxa" w:w="3240"/>
+            <w:vAlign w:val="center"/>
+            <w:tcBorders>
+              <w:top w:val="single" w:sz="4" w:color="D9D9D9"/>
+              <w:left w:val="single" w:sz="4" w:color="D9D9D9"/>
+              <w:bottom w:val="single" w:sz="4" w:color="D9D9D9"/>
+              <w:right w:val="single" w:sz="4" w:color="D9D9D9"/>
+            </w:tcBorders>
+            <w:tcMar>
+              <w:top w:w="90" w:type="dxa"/>
+              <w:bottom w:w="90" w:type="dxa"/>
+              <w:left w:w="110" w:type="dxa"/>
+              <w:right w:w="110" w:type="dxa"/>
+            </w:tcMar>
+            <w:shd w:fill="F1F6F8"/>
+          </w:tcPr>
+          <w:p>
+            <w:pPr>
+              <w:spacing w:after="60" w:line="252" w:lineRule="auto"/>
+            </w:pPr>
+            <w:r>
+              <w:rPr>
+                <w:b/>
+                <w:sz w:val="20"/>
+              </w:rPr>
+              <w:t>A1 Validate the adoption constraint</w:t>
+              <w:br/>
+              <w:t>Produce an evidence register and account fit rules. See Sections 2 and 3.</w:t>
+            </w:r>
+          </w:p>
+        </w:tc>
+        <w:tc>
+          <w:tcPr>
+            <w:tcW w:type="dxa" w:w="1872"/>
+            <w:vAlign w:val="center"/>
+            <w:tcBorders>
+              <w:top w:val="single" w:sz="4" w:color="D9D9D9"/>
+              <w:left w:val="single" w:sz="4" w:color="D9D9D9"/>
+              <w:bottom w:val="single" w:sz="4" w:color="D9D9D9"/>
+              <w:right w:val="single" w:sz="4" w:color="D9D9D9"/>
+            </w:tcBorders>
+            <w:tcMar>
+              <w:top w:w="90" w:type="dxa"/>
+              <w:bottom w:w="90" w:type="dxa"/>
+              <w:left w:w="110" w:type="dxa"/>
+              <w:right w:w="110" w:type="dxa"/>
+            </w:tcMar>
+            <w:shd w:fill="F1F6F8"/>
+          </w:tcPr>
+          <w:p>
+            <w:pPr>
+              <w:spacing w:after="60" w:line="252" w:lineRule="auto"/>
+            </w:pPr>
+            <w:r>
+              <w:rPr>
+                <w:sz w:val="20"/>
+              </w:rPr>
+              <w:t>PM</w:t>
+              <w:br/>
+              <w:t>Days 1 to 7</w:t>
+            </w:r>
+          </w:p>
+        </w:tc>
+        <w:tc>
+          <w:tcPr>
+            <w:tcW w:type="dxa" w:w="4781"/>
+            <w:vAlign w:val="center"/>
+            <w:tcBorders>
+              <w:top w:val="single" w:sz="4" w:color="D9D9D9"/>
+              <w:left w:val="single" w:sz="4" w:color="D9D9D9"/>
+              <w:bottom w:val="single" w:sz="4" w:color="D9D9D9"/>
+              <w:right w:val="single" w:sz="4" w:color="D9D9D9"/>
+            </w:tcBorders>
+            <w:tcMar>
+              <w:top w:w="90" w:type="dxa"/>
+              <w:bottom w:w="90" w:type="dxa"/>
+              <w:left w:w="110" w:type="dxa"/>
+              <w:right w:w="110" w:type="dxa"/>
+            </w:tcMar>
+            <w:shd w:fill="F1F6F8"/>
+          </w:tcPr>
+          <w:p>
+            <w:pPr>
+              <w:spacing w:after="60" w:line="252" w:lineRule="auto"/>
+            </w:pPr>
+            <w:r>
+              <w:rPr>
+                <w:sz w:val="20"/>
+              </w:rPr>
+              <w:t>Dependency: candidate segment and workflow hypothesis.</w:t>
+              <w:br/>
+              <w:t>Done: record recent workflow evidence, integration requirements and competing explanations; name unresolved assumptions.</w:t>
+            </w:r>
+          </w:p>
+        </w:tc>
+      </w:tr>
+      <w:tr>
+        <w:trPr>
+          <w:cantSplit/>
+        </w:trPr>
+        <w:tc>
+          <w:tcPr>
+            <w:tcW w:type="dxa" w:w="3240"/>
+            <w:vAlign w:val="center"/>
+            <w:tcBorders>
+              <w:top w:val="single" w:sz="4" w:color="D9D9D9"/>
+              <w:left w:val="single" w:sz="4" w:color="D9D9D9"/>
+              <w:bottom w:val="single" w:sz="4" w:color="D9D9D9"/>
+              <w:right w:val="single" w:sz="4" w:color="D9D9D9"/>
+            </w:tcBorders>
+            <w:tcMar>
+              <w:top w:w="90" w:type="dxa"/>
+              <w:bottom w:w="90" w:type="dxa"/>
+              <w:left w:w="110" w:type="dxa"/>
+              <w:right w:w="110" w:type="dxa"/>
+            </w:tcMar>
+            <w:shd w:fill="FFFFFF"/>
+          </w:tcPr>
+          <w:p>
+            <w:pPr>
+              <w:spacing w:after="60" w:line="252" w:lineRule="auto"/>
+            </w:pPr>
+            <w:r>
+              <w:rPr>
+                <w:b/>
+                <w:sz w:val="20"/>
+              </w:rPr>
+              <w:t>A2 Define the evaluation offer</w:t>
+              <w:br/>
+              <w:t>Produce scope, package, price hypothesis and qualification questions. See Sections 4 and 6.</w:t>
+            </w:r>
+          </w:p>
+        </w:tc>
+        <w:tc>
+          <w:tcPr>
+            <w:tcW w:type="dxa" w:w="1872"/>
+            <w:vAlign w:val="center"/>
+            <w:tcBorders>
+              <w:top w:val="single" w:sz="4" w:color="D9D9D9"/>
+              <w:left w:val="single" w:sz="4" w:color="D9D9D9"/>
+              <w:bottom w:val="single" w:sz="4" w:color="D9D9D9"/>
+              <w:right w:val="single" w:sz="4" w:color="D9D9D9"/>
+            </w:tcBorders>
+            <w:tcMar>
+              <w:top w:w="90" w:type="dxa"/>
+              <w:bottom w:w="90" w:type="dxa"/>
+              <w:left w:w="110" w:type="dxa"/>
+              <w:right w:w="110" w:type="dxa"/>
+            </w:tcMar>
+            <w:shd w:fill="FFFFFF"/>
+          </w:tcPr>
+          <w:p>
+            <w:pPr>
+              <w:spacing w:after="60" w:line="252" w:lineRule="auto"/>
+            </w:pPr>
+            <w:r>
+              <w:rPr>
+                <w:sz w:val="20"/>
+              </w:rPr>
+              <w:t>PM with sales</w:t>
+              <w:br/>
+              <w:t>Days 6 to 10</w:t>
+            </w:r>
+          </w:p>
+        </w:tc>
+        <w:tc>
+          <w:tcPr>
+            <w:tcW w:type="dxa" w:w="4781"/>
+            <w:vAlign w:val="center"/>
+            <w:tcBorders>
+              <w:top w:val="single" w:sz="4" w:color="D9D9D9"/>
+              <w:left w:val="single" w:sz="4" w:color="D9D9D9"/>
+              <w:bottom w:val="single" w:sz="4" w:color="D9D9D9"/>
+              <w:right w:val="single" w:sz="4" w:color="D9D9D9"/>
+            </w:tcBorders>
+            <w:tcMar>
+              <w:top w:w="90" w:type="dxa"/>
+              <w:bottom w:w="90" w:type="dxa"/>
+              <w:left w:w="110" w:type="dxa"/>
+              <w:right w:w="110" w:type="dxa"/>
+            </w:tcMar>
+            <w:shd w:fill="FFFFFF"/>
+          </w:tcPr>
+          <w:p>
+            <w:pPr>
+              <w:spacing w:after="60" w:line="252" w:lineRule="auto"/>
+            </w:pPr>
+            <w:r>
+              <w:rPr>
+                <w:sz w:val="20"/>
+              </w:rPr>
+              <w:t>Dependency: A1.</w:t>
+              <w:br/>
+              <w:t>Done: exclusions, sponsor, buyer review steps, service effort and decision date are explicit; a seller can qualify an account.</w:t>
+            </w:r>
+          </w:p>
+        </w:tc>
+      </w:tr>
+      <w:tr>
+        <w:trPr>
+          <w:cantSplit/>
+        </w:trPr>
+        <w:tc>
+          <w:tcPr>
+            <w:tcW w:type="dxa" w:w="3240"/>
+            <w:vAlign w:val="center"/>
+            <w:tcBorders>
+              <w:top w:val="single" w:sz="4" w:color="D9D9D9"/>
+              <w:left w:val="single" w:sz="4" w:color="D9D9D9"/>
+              <w:bottom w:val="single" w:sz="4" w:color="D9D9D9"/>
+              <w:right w:val="single" w:sz="4" w:color="D9D9D9"/>
+            </w:tcBorders>
+            <w:tcMar>
+              <w:top w:w="90" w:type="dxa"/>
+              <w:bottom w:w="90" w:type="dxa"/>
+              <w:left w:w="110" w:type="dxa"/>
+              <w:right w:w="110" w:type="dxa"/>
+            </w:tcMar>
+            <w:shd w:fill="F1F6F8"/>
+          </w:tcPr>
+          <w:p>
+            <w:pPr>
+              <w:spacing w:after="60" w:line="252" w:lineRule="auto"/>
+            </w:pPr>
+            <w:r>
+              <w:rPr>
+                <w:b/>
+                <w:sz w:val="20"/>
+              </w:rPr>
+              <w:t>A3 Build the core launch assets</w:t>
+              <w:br/>
+              <w:t>Produce a landing page, product one pager, pricing FAQ and evaluation request form. See Sections 5 and 7.</w:t>
+            </w:r>
+          </w:p>
+        </w:tc>
+        <w:tc>
+          <w:tcPr>
+            <w:tcW w:type="dxa" w:w="1872"/>
+            <w:vAlign w:val="center"/>
+            <w:tcBorders>
+              <w:top w:val="single" w:sz="4" w:color="D9D9D9"/>
+              <w:left w:val="single" w:sz="4" w:color="D9D9D9"/>
+              <w:bottom w:val="single" w:sz="4" w:color="D9D9D9"/>
+              <w:right w:val="single" w:sz="4" w:color="D9D9D9"/>
+            </w:tcBorders>
+            <w:tcMar>
+              <w:top w:w="90" w:type="dxa"/>
+              <w:bottom w:w="90" w:type="dxa"/>
+              <w:left w:w="110" w:type="dxa"/>
+              <w:right w:w="110" w:type="dxa"/>
+            </w:tcMar>
+            <w:shd w:fill="F1F6F8"/>
+          </w:tcPr>
+          <w:p>
+            <w:pPr>
+              <w:spacing w:after="60" w:line="252" w:lineRule="auto"/>
+            </w:pPr>
+            <w:r>
+              <w:rPr>
+                <w:sz w:val="20"/>
+              </w:rPr>
+              <w:t>Product marketing</w:t>
+              <w:br/>
+              <w:t>Days 9 to 15</w:t>
+            </w:r>
+          </w:p>
+        </w:tc>
+        <w:tc>
+          <w:tcPr>
+            <w:tcW w:type="dxa" w:w="4781"/>
+            <w:vAlign w:val="center"/>
+            <w:tcBorders>
+              <w:top w:val="single" w:sz="4" w:color="D9D9D9"/>
+              <w:left w:val="single" w:sz="4" w:color="D9D9D9"/>
+              <w:bottom w:val="single" w:sz="4" w:color="D9D9D9"/>
+              <w:right w:val="single" w:sz="4" w:color="D9D9D9"/>
+            </w:tcBorders>
+            <w:tcMar>
+              <w:top w:w="90" w:type="dxa"/>
+              <w:bottom w:w="90" w:type="dxa"/>
+              <w:left w:w="110" w:type="dxa"/>
+              <w:right w:w="110" w:type="dxa"/>
+            </w:tcMar>
+            <w:shd w:fill="F1F6F8"/>
+          </w:tcPr>
+          <w:p>
+            <w:pPr>
+              <w:spacing w:after="60" w:line="252" w:lineRule="auto"/>
+            </w:pPr>
+            <w:r>
+              <w:rPr>
+                <w:sz w:val="20"/>
+              </w:rPr>
+              <w:t>Dependency: A2 and approved claims.</w:t>
+              <w:br/>
+              <w:t>Done: intended buyer understands the offer and next step; form submission reaches a named owner; unsupported claims removed.</w:t>
+            </w:r>
+          </w:p>
+        </w:tc>
+      </w:tr>
+      <w:tr>
+        <w:trPr>
+          <w:cantSplit/>
+        </w:trPr>
+        <w:tc>
+          <w:tcPr>
+            <w:tcW w:type="dxa" w:w="3240"/>
+            <w:vAlign w:val="center"/>
+            <w:tcBorders>
+              <w:top w:val="single" w:sz="4" w:color="D9D9D9"/>
+              <w:left w:val="single" w:sz="4" w:color="D9D9D9"/>
+              <w:bottom w:val="single" w:sz="4" w:color="D9D9D9"/>
+              <w:right w:val="single" w:sz="4" w:color="D9D9D9"/>
+            </w:tcBorders>
+            <w:tcMar>
+              <w:top w:w="90" w:type="dxa"/>
+              <w:bottom w:w="90" w:type="dxa"/>
+              <w:left w:w="110" w:type="dxa"/>
+              <w:right w:w="110" w:type="dxa"/>
+            </w:tcMar>
+            <w:shd w:fill="FFFFFF"/>
+          </w:tcPr>
+          <w:p>
+            <w:pPr>
+              <w:spacing w:after="60" w:line="252" w:lineRule="auto"/>
+            </w:pPr>
+            <w:r>
+              <w:rPr>
+                <w:b/>
+                <w:sz w:val="20"/>
+              </w:rPr>
+              <w:t>A4 Rehearse selling and delivery</w:t>
+              <w:br/>
+              <w:t>Produce a demo, objection responses, setup guide and escalation route. See Sections 8 to 10.</w:t>
+            </w:r>
+          </w:p>
+        </w:tc>
+        <w:tc>
+          <w:tcPr>
+            <w:tcW w:type="dxa" w:w="1872"/>
+            <w:vAlign w:val="center"/>
+            <w:tcBorders>
+              <w:top w:val="single" w:sz="4" w:color="D9D9D9"/>
+              <w:left w:val="single" w:sz="4" w:color="D9D9D9"/>
+              <w:bottom w:val="single" w:sz="4" w:color="D9D9D9"/>
+              <w:right w:val="single" w:sz="4" w:color="D9D9D9"/>
+            </w:tcBorders>
+            <w:tcMar>
+              <w:top w:w="90" w:type="dxa"/>
+              <w:bottom w:w="90" w:type="dxa"/>
+              <w:left w:w="110" w:type="dxa"/>
+              <w:right w:w="110" w:type="dxa"/>
+            </w:tcMar>
+            <w:shd w:fill="FFFFFF"/>
+          </w:tcPr>
+          <w:p>
+            <w:pPr>
+              <w:spacing w:after="60" w:line="252" w:lineRule="auto"/>
+            </w:pPr>
+            <w:r>
+              <w:rPr>
+                <w:sz w:val="20"/>
+              </w:rPr>
+              <w:t>Sales lead with PM and customer success</w:t>
+              <w:br/>
+              <w:t>Days 11 to 17</w:t>
+            </w:r>
+          </w:p>
+        </w:tc>
+        <w:tc>
+          <w:tcPr>
+            <w:tcW w:type="dxa" w:w="4781"/>
+            <w:vAlign w:val="center"/>
+            <w:tcBorders>
+              <w:top w:val="single" w:sz="4" w:color="D9D9D9"/>
+              <w:left w:val="single" w:sz="4" w:color="D9D9D9"/>
+              <w:bottom w:val="single" w:sz="4" w:color="D9D9D9"/>
+              <w:right w:val="single" w:sz="4" w:color="D9D9D9"/>
+            </w:tcBorders>
+            <w:tcMar>
+              <w:top w:w="90" w:type="dxa"/>
+              <w:bottom w:w="90" w:type="dxa"/>
+              <w:left w:w="110" w:type="dxa"/>
+              <w:right w:w="110" w:type="dxa"/>
+            </w:tcMar>
+            <w:shd w:fill="FFFFFF"/>
+          </w:tcPr>
+          <w:p>
+            <w:pPr>
+              <w:spacing w:after="60" w:line="252" w:lineRule="auto"/>
+            </w:pPr>
+            <w:r>
+              <w:rPr>
+                <w:sz w:val="20"/>
+              </w:rPr>
+              <w:t>Dependency: A2 and working standard flow.</w:t>
+              <w:br/>
+              <w:t>Done: rehearse qualification, a real request, reviewer decision and failed demo recovery; verify delivery capacity.</w:t>
+            </w:r>
+          </w:p>
+        </w:tc>
+      </w:tr>
+      <w:tr>
+        <w:trPr>
+          <w:cantSplit/>
+        </w:trPr>
+        <w:tc>
+          <w:tcPr>
+            <w:tcW w:type="dxa" w:w="3240"/>
+            <w:vAlign w:val="center"/>
+            <w:tcBorders>
+              <w:top w:val="single" w:sz="4" w:color="D9D9D9"/>
+              <w:left w:val="single" w:sz="4" w:color="D9D9D9"/>
+              <w:bottom w:val="single" w:sz="4" w:color="D9D9D9"/>
+              <w:right w:val="single" w:sz="4" w:color="D9D9D9"/>
+            </w:tcBorders>
+            <w:tcMar>
+              <w:top w:w="90" w:type="dxa"/>
+              <w:bottom w:w="90" w:type="dxa"/>
+              <w:left w:w="110" w:type="dxa"/>
+              <w:right w:w="110" w:type="dxa"/>
+            </w:tcMar>
+            <w:shd w:fill="F1F6F8"/>
+          </w:tcPr>
+          <w:p>
+            <w:pPr>
+              <w:spacing w:after="60" w:line="252" w:lineRule="auto"/>
+            </w:pPr>
+            <w:r>
+              <w:rPr>
+                <w:b/>
+                <w:sz w:val="20"/>
+              </w:rPr>
+              <w:t>A5 Instrument the journey</w:t>
+              <w:br/>
+              <w:t>Produce event definitions, account mapping and a funnel report. See Section 11.</w:t>
+            </w:r>
+          </w:p>
+        </w:tc>
+        <w:tc>
+          <w:tcPr>
+            <w:tcW w:type="dxa" w:w="1872"/>
+            <w:vAlign w:val="center"/>
+            <w:tcBorders>
+              <w:top w:val="single" w:sz="4" w:color="D9D9D9"/>
+              <w:left w:val="single" w:sz="4" w:color="D9D9D9"/>
+              <w:bottom w:val="single" w:sz="4" w:color="D9D9D9"/>
+              <w:right w:val="single" w:sz="4" w:color="D9D9D9"/>
+            </w:tcBorders>
+            <w:tcMar>
+              <w:top w:w="90" w:type="dxa"/>
+              <w:bottom w:w="90" w:type="dxa"/>
+              <w:left w:w="110" w:type="dxa"/>
+              <w:right w:w="110" w:type="dxa"/>
+            </w:tcMar>
+            <w:shd w:fill="F1F6F8"/>
+          </w:tcPr>
+          <w:p>
+            <w:pPr>
+              <w:spacing w:after="60" w:line="252" w:lineRule="auto"/>
+            </w:pPr>
+            <w:r>
+              <w:rPr>
+                <w:sz w:val="20"/>
+              </w:rPr>
+              <w:t>Analytics owner</w:t>
+              <w:br/>
+              <w:t>Days 11 to 18</w:t>
+            </w:r>
+          </w:p>
+        </w:tc>
+        <w:tc>
+          <w:tcPr>
+            <w:tcW w:type="dxa" w:w="4781"/>
+            <w:vAlign w:val="center"/>
+            <w:tcBorders>
+              <w:top w:val="single" w:sz="4" w:color="D9D9D9"/>
+              <w:left w:val="single" w:sz="4" w:color="D9D9D9"/>
+              <w:bottom w:val="single" w:sz="4" w:color="D9D9D9"/>
+              <w:right w:val="single" w:sz="4" w:color="D9D9D9"/>
+            </w:tcBorders>
+            <w:tcMar>
+              <w:top w:w="90" w:type="dxa"/>
+              <w:bottom w:w="90" w:type="dxa"/>
+              <w:left w:w="110" w:type="dxa"/>
+              <w:right w:w="110" w:type="dxa"/>
+            </w:tcMar>
+            <w:shd w:fill="F1F6F8"/>
+          </w:tcPr>
+          <w:p>
+            <w:pPr>
+              <w:spacing w:after="60" w:line="252" w:lineRule="auto"/>
+            </w:pPr>
+            <w:r>
+              <w:rPr>
+                <w:sz w:val="20"/>
+              </w:rPr>
+              <w:t>Dependency: agreed evaluation and activation definitions.</w:t>
+              <w:br/>
+              <w:t>Done: a test account follows form, qualification, setup and decision events; duplicate users and sample requests are handled.</w:t>
+            </w:r>
+          </w:p>
+        </w:tc>
+      </w:tr>
+      <w:tr>
+        <w:trPr>
+          <w:cantSplit/>
+        </w:trPr>
+        <w:tc>
+          <w:tcPr>
+            <w:tcW w:type="dxa" w:w="3240"/>
+            <w:vAlign w:val="center"/>
+            <w:tcBorders>
+              <w:top w:val="single" w:sz="4" w:color="D9D9D9"/>
+              <w:left w:val="single" w:sz="4" w:color="D9D9D9"/>
+              <w:bottom w:val="single" w:sz="4" w:color="D9D9D9"/>
+              <w:right w:val="single" w:sz="4" w:color="D9D9D9"/>
+            </w:tcBorders>
+            <w:tcMar>
+              <w:top w:w="90" w:type="dxa"/>
+              <w:bottom w:w="90" w:type="dxa"/>
+              <w:left w:w="110" w:type="dxa"/>
+              <w:right w:w="110" w:type="dxa"/>
+            </w:tcMar>
+            <w:shd w:fill="FFFFFF"/>
+          </w:tcPr>
+          <w:p>
+            <w:pPr>
+              <w:spacing w:after="60" w:line="252" w:lineRule="auto"/>
+            </w:pPr>
+            <w:r>
+              <w:rPr>
+                <w:b/>
+                <w:sz w:val="20"/>
+              </w:rPr>
+              <w:t>A6 Prepare the webinar test</w:t>
+              <w:br/>
+              <w:t>Produce a workflow walkthrough, invitation copy, registration page and follow up plan. See Section 7.</w:t>
+            </w:r>
+          </w:p>
+        </w:tc>
+        <w:tc>
+          <w:tcPr>
+            <w:tcW w:type="dxa" w:w="1872"/>
+            <w:vAlign w:val="center"/>
+            <w:tcBorders>
+              <w:top w:val="single" w:sz="4" w:color="D9D9D9"/>
+              <w:left w:val="single" w:sz="4" w:color="D9D9D9"/>
+              <w:bottom w:val="single" w:sz="4" w:color="D9D9D9"/>
+              <w:right w:val="single" w:sz="4" w:color="D9D9D9"/>
+            </w:tcBorders>
+            <w:tcMar>
+              <w:top w:w="90" w:type="dxa"/>
+              <w:bottom w:w="90" w:type="dxa"/>
+              <w:left w:w="110" w:type="dxa"/>
+              <w:right w:w="110" w:type="dxa"/>
+            </w:tcMar>
+            <w:shd w:fill="FFFFFF"/>
+          </w:tcPr>
+          <w:p>
+            <w:pPr>
+              <w:spacing w:after="60" w:line="252" w:lineRule="auto"/>
+            </w:pPr>
+            <w:r>
+              <w:rPr>
+                <w:sz w:val="20"/>
+              </w:rPr>
+              <w:t>Demand generation</w:t>
+              <w:br/>
+              <w:t>Days 15 to 20</w:t>
+            </w:r>
+          </w:p>
+        </w:tc>
+        <w:tc>
+          <w:tcPr>
+            <w:tcW w:type="dxa" w:w="4781"/>
+            <w:vAlign w:val="center"/>
+            <w:tcBorders>
+              <w:top w:val="single" w:sz="4" w:color="D9D9D9"/>
+              <w:left w:val="single" w:sz="4" w:color="D9D9D9"/>
+              <w:bottom w:val="single" w:sz="4" w:color="D9D9D9"/>
+              <w:right w:val="single" w:sz="4" w:color="D9D9D9"/>
+            </w:tcBorders>
+            <w:tcMar>
+              <w:top w:w="90" w:type="dxa"/>
+              <w:bottom w:w="90" w:type="dxa"/>
+              <w:left w:w="110" w:type="dxa"/>
+              <w:right w:w="110" w:type="dxa"/>
+            </w:tcMar>
+            <w:shd w:fill="FFFFFF"/>
+          </w:tcPr>
+          <w:p>
+            <w:pPr>
+              <w:spacing w:after="60" w:line="252" w:lineRule="auto"/>
+            </w:pPr>
+            <w:r>
+              <w:rPr>
+                <w:sz w:val="20"/>
+              </w:rPr>
+              <w:t>Dependency: A3 to A5 and evaluation capacity.</w:t>
+              <w:br/>
+              <w:t>Done: audience access is evidenced; registration and reminders work; owner, staff effort and spend cap are agreed.</w:t>
+            </w:r>
+          </w:p>
+        </w:tc>
+      </w:tr>
+    </w:tbl>
+    <w:p>
+      <w:pPr>
+        <w:widowControl/>
+        <w:spacing w:after="0"/>
+      </w:pPr>
+    </w:p>
+    <w:p>
+      <w:pPr>
+        <w:pStyle w:val="Heading2"/>
+      </w:pPr>
+      <w:r>
+        <w:t>Gate to the next stage</w:t>
+      </w:r>
+    </w:p>
+    <w:p>
+      <w:pPr>
+        <w:widowControl/>
+      </w:pPr>
+      <w:r>
+        <w:t>Approve the evaluation offer only after the team has evidence for the segment choice, can demonstrate the promised workflow, and has tested the handoff into an evaluation. Asset production does not establish demand.</w:t>
+      </w:r>
+    </w:p>
+    <w:p>
+      <w:r>
+        <w:br w:type="page"/>
+      </w:r>
+    </w:p>
+    <w:p>
+      <w:pPr>
+        <w:pStyle w:val="Heading1"/>
+      </w:pPr>
+      <w:r>
+        <w:t>Activity plan during launch</w:t>
+      </w:r>
+    </w:p>
+    <w:p>
+      <w:pPr>
+        <w:widowControl/>
+      </w:pPr>
+      <w:r>
+        <w:rPr>
+          <w:b/>
+        </w:rPr>
+        <w:t>Illustrative days 21 to 45</w:t>
+      </w:r>
+    </w:p>
+    <w:p>
+      <w:pPr>
+        <w:widowControl/>
+      </w:pPr>
+      <w:r>
+        <w:t>Run a limited acquisition and evaluation cohort. Trace each interested account into qualification and first live value.</w:t>
+      </w:r>
+    </w:p>
+    <w:p>
+      <w:pPr>
+        <w:widowControl/>
+      </w:pPr>
+      <w:r>
+        <w:t>Worked example only. Owners and timing are proposed roles and work windows for the fictional product. Activities depend on the preceding launch gate.</w:t>
+      </w:r>
+    </w:p>
+    <w:tbl>
+      <w:tblPr>
+        <w:tblW w:type="auto" w:w="0"/>
+        <w:jc w:val="center"/>
+        <w:tblLayout w:type="fixed"/>
+        <w:tblLook w:firstColumn="1" w:firstRow="1" w:lastColumn="0" w:lastRow="0" w:noHBand="0" w:noVBand="1" w:val="04A0"/>
+      </w:tblPr>
+      <w:tblGrid>
+        <w:gridCol w:w="3240"/>
+        <w:gridCol w:w="1872"/>
+        <w:gridCol w:w="4781"/>
+      </w:tblGrid>
+      <w:tr>
+        <w:trPr>
+          <w:cantSplit/>
+          <w:tblHeader/>
+        </w:trPr>
+        <w:tc>
+          <w:tcPr>
+            <w:tcW w:type="dxa" w:w="3240"/>
+            <w:vAlign w:val="center"/>
+            <w:tcBorders>
+              <w:top w:val="single" w:sz="4" w:color="D9D9D9"/>
+              <w:left w:val="single" w:sz="4" w:color="D9D9D9"/>
+              <w:bottom w:val="single" w:sz="4" w:color="D9D9D9"/>
+              <w:right w:val="single" w:sz="4" w:color="D9D9D9"/>
+            </w:tcBorders>
+            <w:tcMar>
+              <w:top w:w="90" w:type="dxa"/>
+              <w:bottom w:w="90" w:type="dxa"/>
+              <w:left w:w="110" w:type="dxa"/>
+              <w:right w:w="110" w:type="dxa"/>
+            </w:tcMar>
+            <w:shd w:fill="153C52"/>
+          </w:tcPr>
+          <w:p>
+            <w:pPr>
+              <w:spacing w:after="60" w:line="252" w:lineRule="auto"/>
+            </w:pPr>
+            <w:r>
+              <w:rPr>
+                <w:b/>
+                <w:color w:val="FFFFFF"/>
+                <w:sz w:val="20"/>
+              </w:rPr>
+              <w:t>Activity and output</w:t>
+            </w:r>
+          </w:p>
+        </w:tc>
+        <w:tc>
+          <w:tcPr>
+            <w:tcW w:type="dxa" w:w="1872"/>
+            <w:vAlign w:val="center"/>
+            <w:tcBorders>
+              <w:top w:val="single" w:sz="4" w:color="D9D9D9"/>
+              <w:left w:val="single" w:sz="4" w:color="D9D9D9"/>
+              <w:bottom w:val="single" w:sz="4" w:color="D9D9D9"/>
+              <w:right w:val="single" w:sz="4" w:color="D9D9D9"/>
+            </w:tcBorders>
+            <w:tcMar>
+              <w:top w:w="90" w:type="dxa"/>
+              <w:bottom w:w="90" w:type="dxa"/>
+              <w:left w:w="110" w:type="dxa"/>
+              <w:right w:w="110" w:type="dxa"/>
+            </w:tcMar>
+            <w:shd w:fill="153C52"/>
+          </w:tcPr>
+          <w:p>
+            <w:pPr>
+              <w:spacing w:after="60" w:line="252" w:lineRule="auto"/>
+            </w:pPr>
+            <w:r>
+              <w:rPr>
+                <w:b/>
+                <w:color w:val="FFFFFF"/>
+                <w:sz w:val="20"/>
+              </w:rPr>
+              <w:t>Owner and timing</w:t>
+            </w:r>
+          </w:p>
+        </w:tc>
+        <w:tc>
+          <w:tcPr>
+            <w:tcW w:type="dxa" w:w="4781"/>
+            <w:vAlign w:val="center"/>
+            <w:tcBorders>
+              <w:top w:val="single" w:sz="4" w:color="D9D9D9"/>
+              <w:left w:val="single" w:sz="4" w:color="D9D9D9"/>
+              <w:bottom w:val="single" w:sz="4" w:color="D9D9D9"/>
+              <w:right w:val="single" w:sz="4" w:color="D9D9D9"/>
+            </w:tcBorders>
+            <w:tcMar>
+              <w:top w:w="90" w:type="dxa"/>
+              <w:bottom w:w="90" w:type="dxa"/>
+              <w:left w:w="110" w:type="dxa"/>
+              <w:right w:w="110" w:type="dxa"/>
+            </w:tcMar>
+            <w:shd w:fill="153C52"/>
+          </w:tcPr>
+          <w:p>
+            <w:pPr>
+              <w:spacing w:after="60" w:line="252" w:lineRule="auto"/>
+            </w:pPr>
+            <w:r>
+              <w:rPr>
+                <w:b/>
+                <w:color w:val="FFFFFF"/>
+                <w:sz w:val="20"/>
+              </w:rPr>
+              <w:t>Dependencies and completion</w:t>
+            </w:r>
+          </w:p>
+        </w:tc>
+      </w:tr>
+      <w:tr>
+        <w:trPr>
+          <w:cantSplit/>
+        </w:trPr>
+        <w:tc>
+          <w:tcPr>
+            <w:tcW w:type="dxa" w:w="3240"/>
+            <w:vAlign w:val="center"/>
+            <w:tcBorders>
+              <w:top w:val="single" w:sz="4" w:color="D9D9D9"/>
+              <w:left w:val="single" w:sz="4" w:color="D9D9D9"/>
+              <w:bottom w:val="single" w:sz="4" w:color="D9D9D9"/>
+              <w:right w:val="single" w:sz="4" w:color="D9D9D9"/>
+            </w:tcBorders>
+            <w:tcMar>
+              <w:top w:w="90" w:type="dxa"/>
+              <w:bottom w:w="90" w:type="dxa"/>
+              <w:left w:w="110" w:type="dxa"/>
+              <w:right w:w="110" w:type="dxa"/>
+            </w:tcMar>
+            <w:shd w:fill="F1F6F8"/>
+          </w:tcPr>
+          <w:p>
+            <w:pPr>
+              <w:spacing w:after="60" w:line="252" w:lineRule="auto"/>
+            </w:pPr>
+            <w:r>
+              <w:rPr>
+                <w:b/>
+                <w:sz w:val="20"/>
+              </w:rPr>
+              <w:t>A7 Release approved communications</w:t>
+              <w:br/>
+              <w:t>Publish the offer page, send targeted invitations and brief the internal team. See Sections 5 and 7.</w:t>
+            </w:r>
+          </w:p>
+        </w:tc>
+        <w:tc>
+          <w:tcPr>
+            <w:tcW w:type="dxa" w:w="1872"/>
+            <w:vAlign w:val="center"/>
+            <w:tcBorders>
+              <w:top w:val="single" w:sz="4" w:color="D9D9D9"/>
+              <w:left w:val="single" w:sz="4" w:color="D9D9D9"/>
+              <w:bottom w:val="single" w:sz="4" w:color="D9D9D9"/>
+              <w:right w:val="single" w:sz="4" w:color="D9D9D9"/>
+            </w:tcBorders>
+            <w:tcMar>
+              <w:top w:w="90" w:type="dxa"/>
+              <w:bottom w:w="90" w:type="dxa"/>
+              <w:left w:w="110" w:type="dxa"/>
+              <w:right w:w="110" w:type="dxa"/>
+            </w:tcMar>
+            <w:shd w:fill="F1F6F8"/>
+          </w:tcPr>
+          <w:p>
+            <w:pPr>
+              <w:spacing w:after="60" w:line="252" w:lineRule="auto"/>
+            </w:pPr>
+            <w:r>
+              <w:rPr>
+                <w:sz w:val="20"/>
+              </w:rPr>
+              <w:t>Product marketing</w:t>
+              <w:br/>
+              <w:t>Days 21 to 23</w:t>
+            </w:r>
+          </w:p>
+        </w:tc>
+        <w:tc>
+          <w:tcPr>
+            <w:tcW w:type="dxa" w:w="4781"/>
+            <w:vAlign w:val="center"/>
+            <w:tcBorders>
+              <w:top w:val="single" w:sz="4" w:color="D9D9D9"/>
+              <w:left w:val="single" w:sz="4" w:color="D9D9D9"/>
+              <w:bottom w:val="single" w:sz="4" w:color="D9D9D9"/>
+              <w:right w:val="single" w:sz="4" w:color="D9D9D9"/>
+            </w:tcBorders>
+            <w:tcMar>
+              <w:top w:w="90" w:type="dxa"/>
+              <w:bottom w:w="90" w:type="dxa"/>
+              <w:left w:w="110" w:type="dxa"/>
+              <w:right w:w="110" w:type="dxa"/>
+            </w:tcMar>
+            <w:shd w:fill="F1F6F8"/>
+          </w:tcPr>
+          <w:p>
+            <w:pPr>
+              <w:spacing w:after="60" w:line="252" w:lineRule="auto"/>
+            </w:pPr>
+            <w:r>
+              <w:rPr>
+                <w:sz w:val="20"/>
+              </w:rPr>
+              <w:t>Dependency: prelaunch gate and A3, A4, A6.</w:t>
+              <w:br/>
+              <w:t>Done: offer, exclusions and call to action agree across channels; request routing and support coverage remain available.</w:t>
+            </w:r>
+          </w:p>
+        </w:tc>
+      </w:tr>
+      <w:tr>
+        <w:trPr>
+          <w:cantSplit/>
+        </w:trPr>
+        <w:tc>
+          <w:tcPr>
+            <w:tcW w:type="dxa" w:w="3240"/>
+            <w:vAlign w:val="center"/>
+            <w:tcBorders>
+              <w:top w:val="single" w:sz="4" w:color="D9D9D9"/>
+              <w:left w:val="single" w:sz="4" w:color="D9D9D9"/>
+              <w:bottom w:val="single" w:sz="4" w:color="D9D9D9"/>
+              <w:right w:val="single" w:sz="4" w:color="D9D9D9"/>
+            </w:tcBorders>
+            <w:tcMar>
+              <w:top w:w="90" w:type="dxa"/>
+              <w:bottom w:w="90" w:type="dxa"/>
+              <w:left w:w="110" w:type="dxa"/>
+              <w:right w:w="110" w:type="dxa"/>
+            </w:tcMar>
+            <w:shd w:fill="FFFFFF"/>
+          </w:tcPr>
+          <w:p>
+            <w:pPr>
+              <w:spacing w:after="60" w:line="252" w:lineRule="auto"/>
+            </w:pPr>
+            <w:r>
+              <w:rPr>
+                <w:b/>
+                <w:sz w:val="20"/>
+              </w:rPr>
+              <w:t>A8 Run the focused webinar</w:t>
+              <w:br/>
+              <w:t>Demonstrate document submission, approval routing and the next evaluation step.</w:t>
+            </w:r>
+          </w:p>
+        </w:tc>
+        <w:tc>
+          <w:tcPr>
+            <w:tcW w:type="dxa" w:w="1872"/>
+            <w:vAlign w:val="center"/>
+            <w:tcBorders>
+              <w:top w:val="single" w:sz="4" w:color="D9D9D9"/>
+              <w:left w:val="single" w:sz="4" w:color="D9D9D9"/>
+              <w:bottom w:val="single" w:sz="4" w:color="D9D9D9"/>
+              <w:right w:val="single" w:sz="4" w:color="D9D9D9"/>
+            </w:tcBorders>
+            <w:tcMar>
+              <w:top w:w="90" w:type="dxa"/>
+              <w:bottom w:w="90" w:type="dxa"/>
+              <w:left w:w="110" w:type="dxa"/>
+              <w:right w:w="110" w:type="dxa"/>
+            </w:tcMar>
+            <w:shd w:fill="FFFFFF"/>
+          </w:tcPr>
+          <w:p>
+            <w:pPr>
+              <w:spacing w:after="60" w:line="252" w:lineRule="auto"/>
+            </w:pPr>
+            <w:r>
+              <w:rPr>
+                <w:sz w:val="20"/>
+              </w:rPr>
+              <w:t>Demand generation with PM</w:t>
+              <w:br/>
+              <w:t>Days 24 to 27</w:t>
+            </w:r>
+          </w:p>
+        </w:tc>
+        <w:tc>
+          <w:tcPr>
+            <w:tcW w:type="dxa" w:w="4781"/>
+            <w:vAlign w:val="center"/>
+            <w:tcBorders>
+              <w:top w:val="single" w:sz="4" w:color="D9D9D9"/>
+              <w:left w:val="single" w:sz="4" w:color="D9D9D9"/>
+              <w:bottom w:val="single" w:sz="4" w:color="D9D9D9"/>
+              <w:right w:val="single" w:sz="4" w:color="D9D9D9"/>
+            </w:tcBorders>
+            <w:tcMar>
+              <w:top w:w="90" w:type="dxa"/>
+              <w:bottom w:w="90" w:type="dxa"/>
+              <w:left w:w="110" w:type="dxa"/>
+              <w:right w:w="110" w:type="dxa"/>
+            </w:tcMar>
+            <w:shd w:fill="FFFFFF"/>
+          </w:tcPr>
+          <w:p>
+            <w:pPr>
+              <w:spacing w:after="60" w:line="252" w:lineRule="auto"/>
+            </w:pPr>
+            <w:r>
+              <w:rPr>
+                <w:sz w:val="20"/>
+              </w:rPr>
+              <w:t>Dependency: A6 and working demonstration.</w:t>
+              <w:br/>
+              <w:t>Done: capture account level attendance and requests; separate learning interest from a commitment to evaluate.</w:t>
+            </w:r>
+          </w:p>
+        </w:tc>
+      </w:tr>
+      <w:tr>
+        <w:trPr>
+          <w:cantSplit/>
+        </w:trPr>
+        <w:tc>
+          <w:tcPr>
+            <w:tcW w:type="dxa" w:w="3240"/>
+            <w:vAlign w:val="center"/>
+            <w:tcBorders>
+              <w:top w:val="single" w:sz="4" w:color="D9D9D9"/>
+              <w:left w:val="single" w:sz="4" w:color="D9D9D9"/>
+              <w:bottom w:val="single" w:sz="4" w:color="D9D9D9"/>
+              <w:right w:val="single" w:sz="4" w:color="D9D9D9"/>
+            </w:tcBorders>
+            <w:tcMar>
+              <w:top w:w="90" w:type="dxa"/>
+              <w:bottom w:w="90" w:type="dxa"/>
+              <w:left w:w="110" w:type="dxa"/>
+              <w:right w:w="110" w:type="dxa"/>
+            </w:tcMar>
+            <w:shd w:fill="F1F6F8"/>
+          </w:tcPr>
+          <w:p>
+            <w:pPr>
+              <w:spacing w:after="60" w:line="252" w:lineRule="auto"/>
+            </w:pPr>
+            <w:r>
+              <w:rPr>
+                <w:b/>
+                <w:sz w:val="20"/>
+              </w:rPr>
+              <w:t>A9 Qualify and follow up</w:t>
+              <w:br/>
+              <w:t>Use the fit rules, record buyer roles and agree an evaluation decision date.</w:t>
+            </w:r>
+          </w:p>
+        </w:tc>
+        <w:tc>
+          <w:tcPr>
+            <w:tcW w:type="dxa" w:w="1872"/>
+            <w:vAlign w:val="center"/>
+            <w:tcBorders>
+              <w:top w:val="single" w:sz="4" w:color="D9D9D9"/>
+              <w:left w:val="single" w:sz="4" w:color="D9D9D9"/>
+              <w:bottom w:val="single" w:sz="4" w:color="D9D9D9"/>
+              <w:right w:val="single" w:sz="4" w:color="D9D9D9"/>
+            </w:tcBorders>
+            <w:tcMar>
+              <w:top w:w="90" w:type="dxa"/>
+              <w:bottom w:w="90" w:type="dxa"/>
+              <w:left w:w="110" w:type="dxa"/>
+              <w:right w:w="110" w:type="dxa"/>
+            </w:tcMar>
+            <w:shd w:fill="F1F6F8"/>
+          </w:tcPr>
+          <w:p>
+            <w:pPr>
+              <w:spacing w:after="60" w:line="252" w:lineRule="auto"/>
+            </w:pPr>
+            <w:r>
+              <w:rPr>
+                <w:sz w:val="20"/>
+              </w:rPr>
+              <w:t>Sales</w:t>
+              <w:br/>
+              <w:t>Days 25 to 32</w:t>
+            </w:r>
+          </w:p>
+        </w:tc>
+        <w:tc>
+          <w:tcPr>
+            <w:tcW w:type="dxa" w:w="4781"/>
+            <w:vAlign w:val="center"/>
+            <w:tcBorders>
+              <w:top w:val="single" w:sz="4" w:color="D9D9D9"/>
+              <w:left w:val="single" w:sz="4" w:color="D9D9D9"/>
+              <w:bottom w:val="single" w:sz="4" w:color="D9D9D9"/>
+              <w:right w:val="single" w:sz="4" w:color="D9D9D9"/>
+            </w:tcBorders>
+            <w:tcMar>
+              <w:top w:w="90" w:type="dxa"/>
+              <w:bottom w:w="90" w:type="dxa"/>
+              <w:left w:w="110" w:type="dxa"/>
+              <w:right w:w="110" w:type="dxa"/>
+            </w:tcMar>
+            <w:shd w:fill="F1F6F8"/>
+          </w:tcPr>
+          <w:p>
+            <w:pPr>
+              <w:spacing w:after="60" w:line="252" w:lineRule="auto"/>
+            </w:pPr>
+            <w:r>
+              <w:rPr>
+                <w:sz w:val="20"/>
+              </w:rPr>
+              <w:t>Dependency: A7 or A8 account interest.</w:t>
+              <w:br/>
+              <w:t>Done: each request has an owner and disposition; unsuitable integration needs are deferred; eligible accounts have a sponsor and scope.</w:t>
+            </w:r>
+          </w:p>
+        </w:tc>
+      </w:tr>
+      <w:tr>
+        <w:trPr>
+          <w:cantSplit/>
+        </w:trPr>
+        <w:tc>
+          <w:tcPr>
+            <w:tcW w:type="dxa" w:w="3240"/>
+            <w:vAlign w:val="center"/>
+            <w:tcBorders>
+              <w:top w:val="single" w:sz="4" w:color="D9D9D9"/>
+              <w:left w:val="single" w:sz="4" w:color="D9D9D9"/>
+              <w:bottom w:val="single" w:sz="4" w:color="D9D9D9"/>
+              <w:right w:val="single" w:sz="4" w:color="D9D9D9"/>
+            </w:tcBorders>
+            <w:tcMar>
+              <w:top w:w="90" w:type="dxa"/>
+              <w:bottom w:w="90" w:type="dxa"/>
+              <w:left w:w="110" w:type="dxa"/>
+              <w:right w:w="110" w:type="dxa"/>
+            </w:tcMar>
+            <w:shd w:fill="FFFFFF"/>
+          </w:tcPr>
+          <w:p>
+            <w:pPr>
+              <w:spacing w:after="60" w:line="252" w:lineRule="auto"/>
+            </w:pPr>
+            <w:r>
+              <w:rPr>
+                <w:b/>
+                <w:sz w:val="20"/>
+              </w:rPr>
+              <w:t>A10 Configure and onboard</w:t>
+              <w:br/>
+              <w:t>Provide the routing setup session and run a first eligible live request. See Section 8.</w:t>
+            </w:r>
+          </w:p>
+        </w:tc>
+        <w:tc>
+          <w:tcPr>
+            <w:tcW w:type="dxa" w:w="1872"/>
+            <w:vAlign w:val="center"/>
+            <w:tcBorders>
+              <w:top w:val="single" w:sz="4" w:color="D9D9D9"/>
+              <w:left w:val="single" w:sz="4" w:color="D9D9D9"/>
+              <w:bottom w:val="single" w:sz="4" w:color="D9D9D9"/>
+              <w:right w:val="single" w:sz="4" w:color="D9D9D9"/>
+            </w:tcBorders>
+            <w:tcMar>
+              <w:top w:w="90" w:type="dxa"/>
+              <w:bottom w:w="90" w:type="dxa"/>
+              <w:left w:w="110" w:type="dxa"/>
+              <w:right w:w="110" w:type="dxa"/>
+            </w:tcMar>
+            <w:shd w:fill="FFFFFF"/>
+          </w:tcPr>
+          <w:p>
+            <w:pPr>
+              <w:spacing w:after="60" w:line="252" w:lineRule="auto"/>
+            </w:pPr>
+            <w:r>
+              <w:rPr>
+                <w:sz w:val="20"/>
+              </w:rPr>
+              <w:t>Customer success</w:t>
+              <w:br/>
+              <w:t>Days 28 to 42</w:t>
+            </w:r>
+          </w:p>
+        </w:tc>
+        <w:tc>
+          <w:tcPr>
+            <w:tcW w:type="dxa" w:w="4781"/>
+            <w:vAlign w:val="center"/>
+            <w:tcBorders>
+              <w:top w:val="single" w:sz="4" w:color="D9D9D9"/>
+              <w:left w:val="single" w:sz="4" w:color="D9D9D9"/>
+              <w:bottom w:val="single" w:sz="4" w:color="D9D9D9"/>
+              <w:right w:val="single" w:sz="4" w:color="D9D9D9"/>
+            </w:tcBorders>
+            <w:tcMar>
+              <w:top w:w="90" w:type="dxa"/>
+              <w:bottom w:w="90" w:type="dxa"/>
+              <w:left w:w="110" w:type="dxa"/>
+              <w:right w:w="110" w:type="dxa"/>
+            </w:tcMar>
+            <w:shd w:fill="FFFFFF"/>
+          </w:tcPr>
+          <w:p>
+            <w:pPr>
+              <w:spacing w:after="60" w:line="252" w:lineRule="auto"/>
+            </w:pPr>
+            <w:r>
+              <w:rPr>
+                <w:sz w:val="20"/>
+              </w:rPr>
+              <w:t>Dependency: A9, permissions, reviewer and customer inputs.</w:t>
+              <w:br/>
+              <w:t>Done: a qualifying request reaches a recorded decision; log waiting time, setup effort and unresolved blockers.</w:t>
+            </w:r>
+          </w:p>
+        </w:tc>
+      </w:tr>
+      <w:tr>
+        <w:trPr>
+          <w:cantSplit/>
+        </w:trPr>
+        <w:tc>
+          <w:tcPr>
+            <w:tcW w:type="dxa" w:w="3240"/>
+            <w:vAlign w:val="center"/>
+            <w:tcBorders>
+              <w:top w:val="single" w:sz="4" w:color="D9D9D9"/>
+              <w:left w:val="single" w:sz="4" w:color="D9D9D9"/>
+              <w:bottom w:val="single" w:sz="4" w:color="D9D9D9"/>
+              <w:right w:val="single" w:sz="4" w:color="D9D9D9"/>
+            </w:tcBorders>
+            <w:tcMar>
+              <w:top w:w="90" w:type="dxa"/>
+              <w:bottom w:w="90" w:type="dxa"/>
+              <w:left w:w="110" w:type="dxa"/>
+              <w:right w:w="110" w:type="dxa"/>
+            </w:tcMar>
+            <w:shd w:fill="F1F6F8"/>
+          </w:tcPr>
+          <w:p>
+            <w:pPr>
+              <w:spacing w:after="60" w:line="252" w:lineRule="auto"/>
+            </w:pPr>
+            <w:r>
+              <w:rPr>
+                <w:b/>
+                <w:sz w:val="20"/>
+              </w:rPr>
+              <w:t>A11 Prepare a scoped partner handoff</w:t>
+              <w:br/>
+              <w:t>Rehearse configuration responsibilities using the sample workflow. See Section 9.</w:t>
+            </w:r>
+          </w:p>
+        </w:tc>
+        <w:tc>
+          <w:tcPr>
+            <w:tcW w:type="dxa" w:w="1872"/>
+            <w:vAlign w:val="center"/>
+            <w:tcBorders>
+              <w:top w:val="single" w:sz="4" w:color="D9D9D9"/>
+              <w:left w:val="single" w:sz="4" w:color="D9D9D9"/>
+              <w:bottom w:val="single" w:sz="4" w:color="D9D9D9"/>
+              <w:right w:val="single" w:sz="4" w:color="D9D9D9"/>
+            </w:tcBorders>
+            <w:tcMar>
+              <w:top w:w="90" w:type="dxa"/>
+              <w:bottom w:w="90" w:type="dxa"/>
+              <w:left w:w="110" w:type="dxa"/>
+              <w:right w:w="110" w:type="dxa"/>
+            </w:tcMar>
+            <w:shd w:fill="F1F6F8"/>
+          </w:tcPr>
+          <w:p>
+            <w:pPr>
+              <w:spacing w:after="60" w:line="252" w:lineRule="auto"/>
+            </w:pPr>
+            <w:r>
+              <w:rPr>
+                <w:sz w:val="20"/>
+              </w:rPr>
+              <w:t>Partner lead</w:t>
+              <w:br/>
+              <w:t>Days 30 to 40 if a partner is involved</w:t>
+            </w:r>
+          </w:p>
+        </w:tc>
+        <w:tc>
+          <w:tcPr>
+            <w:tcW w:type="dxa" w:w="4781"/>
+            <w:vAlign w:val="center"/>
+            <w:tcBorders>
+              <w:top w:val="single" w:sz="4" w:color="D9D9D9"/>
+              <w:left w:val="single" w:sz="4" w:color="D9D9D9"/>
+              <w:bottom w:val="single" w:sz="4" w:color="D9D9D9"/>
+              <w:right w:val="single" w:sz="4" w:color="D9D9D9"/>
+            </w:tcBorders>
+            <w:tcMar>
+              <w:top w:w="90" w:type="dxa"/>
+              <w:bottom w:w="90" w:type="dxa"/>
+              <w:left w:w="110" w:type="dxa"/>
+              <w:right w:w="110" w:type="dxa"/>
+            </w:tcMar>
+            <w:shd w:fill="F1F6F8"/>
+          </w:tcPr>
+          <w:p>
+            <w:pPr>
+              <w:spacing w:after="60" w:line="252" w:lineRule="auto"/>
+            </w:pPr>
+            <w:r>
+              <w:rPr>
+                <w:sz w:val="20"/>
+              </w:rPr>
+              <w:t>Dependency: partner responsibilities and implementation scope agreed.</w:t>
+              <w:br/>
+              <w:t>Done: referral, setup and escalation owners can complete the handoff; omit this work if delivery is direct.</w:t>
+            </w:r>
+          </w:p>
+        </w:tc>
+      </w:tr>
+      <w:tr>
+        <w:trPr>
+          <w:cantSplit/>
+        </w:trPr>
+        <w:tc>
+          <w:tcPr>
+            <w:tcW w:type="dxa" w:w="3240"/>
+            <w:vAlign w:val="center"/>
+            <w:tcBorders>
+              <w:top w:val="single" w:sz="4" w:color="D9D9D9"/>
+              <w:left w:val="single" w:sz="4" w:color="D9D9D9"/>
+              <w:bottom w:val="single" w:sz="4" w:color="D9D9D9"/>
+              <w:right w:val="single" w:sz="4" w:color="D9D9D9"/>
+            </w:tcBorders>
+            <w:tcMar>
+              <w:top w:w="90" w:type="dxa"/>
+              <w:bottom w:w="90" w:type="dxa"/>
+              <w:left w:w="110" w:type="dxa"/>
+              <w:right w:w="110" w:type="dxa"/>
+            </w:tcMar>
+            <w:shd w:fill="FFFFFF"/>
+          </w:tcPr>
+          <w:p>
+            <w:pPr>
+              <w:spacing w:after="60" w:line="252" w:lineRule="auto"/>
+            </w:pPr>
+            <w:r>
+              <w:rPr>
+                <w:b/>
+                <w:sz w:val="20"/>
+              </w:rPr>
+              <w:t>A12 Review the cohort each week</w:t>
+              <w:br/>
+              <w:t>Produce an account status report and an updated activity register.</w:t>
+            </w:r>
+          </w:p>
+        </w:tc>
+        <w:tc>
+          <w:tcPr>
+            <w:tcW w:type="dxa" w:w="1872"/>
+            <w:vAlign w:val="center"/>
+            <w:tcBorders>
+              <w:top w:val="single" w:sz="4" w:color="D9D9D9"/>
+              <w:left w:val="single" w:sz="4" w:color="D9D9D9"/>
+              <w:bottom w:val="single" w:sz="4" w:color="D9D9D9"/>
+              <w:right w:val="single" w:sz="4" w:color="D9D9D9"/>
+            </w:tcBorders>
+            <w:tcMar>
+              <w:top w:w="90" w:type="dxa"/>
+              <w:bottom w:w="90" w:type="dxa"/>
+              <w:left w:w="110" w:type="dxa"/>
+              <w:right w:w="110" w:type="dxa"/>
+            </w:tcMar>
+            <w:shd w:fill="FFFFFF"/>
+          </w:tcPr>
+          <w:p>
+            <w:pPr>
+              <w:spacing w:after="60" w:line="252" w:lineRule="auto"/>
+            </w:pPr>
+            <w:r>
+              <w:rPr>
+                <w:sz w:val="20"/>
+              </w:rPr>
+              <w:t>PM with sales and customer success</w:t>
+              <w:br/>
+              <w:t>Days 28, 35 and 42</w:t>
+            </w:r>
+          </w:p>
+        </w:tc>
+        <w:tc>
+          <w:tcPr>
+            <w:tcW w:type="dxa" w:w="4781"/>
+            <w:vAlign w:val="center"/>
+            <w:tcBorders>
+              <w:top w:val="single" w:sz="4" w:color="D9D9D9"/>
+              <w:left w:val="single" w:sz="4" w:color="D9D9D9"/>
+              <w:bottom w:val="single" w:sz="4" w:color="D9D9D9"/>
+              <w:right w:val="single" w:sz="4" w:color="D9D9D9"/>
+            </w:tcBorders>
+            <w:tcMar>
+              <w:top w:w="90" w:type="dxa"/>
+              <w:bottom w:w="90" w:type="dxa"/>
+              <w:left w:w="110" w:type="dxa"/>
+              <w:right w:w="110" w:type="dxa"/>
+            </w:tcMar>
+            <w:shd w:fill="FFFFFF"/>
+          </w:tcPr>
+          <w:p>
+            <w:pPr>
+              <w:spacing w:after="60" w:line="252" w:lineRule="auto"/>
+            </w:pPr>
+            <w:r>
+              <w:rPr>
+                <w:sz w:val="20"/>
+              </w:rPr>
+              <w:t>Dependency: A5 and current account records.</w:t>
+              <w:br/>
+              <w:t>Done: distinguish unfinished evaluations from failures; assign blocked work; decide whether to continue, adjust or pause.</w:t>
+            </w:r>
+          </w:p>
+        </w:tc>
+      </w:tr>
+    </w:tbl>
+    <w:p>
+      <w:pPr>
+        <w:widowControl/>
+        <w:spacing w:after="0"/>
+      </w:pPr>
+    </w:p>
+    <w:p>
+      <w:pPr>
+        <w:pStyle w:val="Heading2"/>
+      </w:pPr>
+      <w:r>
+        <w:t>Gate to the next stage</w:t>
+      </w:r>
+    </w:p>
+    <w:p>
+      <w:pPr>
+        <w:widowControl/>
+      </w:pPr>
+      <w:r>
+        <w:t>A named launch owner decides whether the next cohort can start. Hold invitations if evaluation capacity is full, the standard workflow fails, or billing and access requirements are unresolved.</w:t>
+      </w:r>
+    </w:p>
+    <w:p>
+      <w:r>
+        <w:br w:type="page"/>
+      </w:r>
+    </w:p>
+    <w:p>
+      <w:pPr>
+        <w:pStyle w:val="Heading1"/>
+      </w:pPr>
+      <w:r>
+        <w:t>Activity plan after launch</w:t>
+      </w:r>
+    </w:p>
+    <w:p>
+      <w:pPr>
+        <w:widowControl/>
+      </w:pPr>
+      <w:r>
+        <w:rPr>
+          <w:b/>
+        </w:rPr>
+        <w:t>Illustrative days 46 to 90</w:t>
+      </w:r>
+    </w:p>
+    <w:p>
+      <w:pPr>
+        <w:widowControl/>
+      </w:pPr>
+      <w:r>
+        <w:t>Convert completed evaluations, learn why accounts stalled and decide whether a wider launch is justified.</w:t>
+      </w:r>
+    </w:p>
+    <w:p>
+      <w:pPr>
+        <w:widowControl/>
+      </w:pPr>
+      <w:r>
+        <w:t>Worked example only. Owners and timing are proposed roles and work windows for the fictional product. Activities depend on the preceding launch gate.</w:t>
+      </w:r>
+    </w:p>
+    <w:tbl>
+      <w:tblPr>
+        <w:tblW w:type="auto" w:w="0"/>
+        <w:jc w:val="center"/>
+        <w:tblLayout w:type="fixed"/>
+        <w:tblLook w:firstColumn="1" w:firstRow="1" w:lastColumn="0" w:lastRow="0" w:noHBand="0" w:noVBand="1" w:val="04A0"/>
+      </w:tblPr>
+      <w:tblGrid>
+        <w:gridCol w:w="3240"/>
+        <w:gridCol w:w="1872"/>
+        <w:gridCol w:w="4781"/>
+      </w:tblGrid>
+      <w:tr>
+        <w:trPr>
+          <w:cantSplit/>
+          <w:tblHeader/>
+        </w:trPr>
+        <w:tc>
+          <w:tcPr>
+            <w:tcW w:type="dxa" w:w="3240"/>
+            <w:vAlign w:val="center"/>
+            <w:tcBorders>
+              <w:top w:val="single" w:sz="4" w:color="D9D9D9"/>
+              <w:left w:val="single" w:sz="4" w:color="D9D9D9"/>
+              <w:bottom w:val="single" w:sz="4" w:color="D9D9D9"/>
+              <w:right w:val="single" w:sz="4" w:color="D9D9D9"/>
+            </w:tcBorders>
+            <w:tcMar>
+              <w:top w:w="90" w:type="dxa"/>
+              <w:bottom w:w="90" w:type="dxa"/>
+              <w:left w:w="110" w:type="dxa"/>
+              <w:right w:w="110" w:type="dxa"/>
+            </w:tcMar>
+            <w:shd w:fill="153C52"/>
+          </w:tcPr>
+          <w:p>
+            <w:pPr>
+              <w:spacing w:after="60" w:line="252" w:lineRule="auto"/>
+            </w:pPr>
+            <w:r>
+              <w:rPr>
+                <w:b/>
+                <w:color w:val="FFFFFF"/>
+                <w:sz w:val="20"/>
+              </w:rPr>
+              <w:t>Activity and output</w:t>
+            </w:r>
+          </w:p>
+        </w:tc>
+        <w:tc>
+          <w:tcPr>
+            <w:tcW w:type="dxa" w:w="1872"/>
+            <w:vAlign w:val="center"/>
+            <w:tcBorders>
+              <w:top w:val="single" w:sz="4" w:color="D9D9D9"/>
+              <w:left w:val="single" w:sz="4" w:color="D9D9D9"/>
+              <w:bottom w:val="single" w:sz="4" w:color="D9D9D9"/>
+              <w:right w:val="single" w:sz="4" w:color="D9D9D9"/>
+            </w:tcBorders>
+            <w:tcMar>
+              <w:top w:w="90" w:type="dxa"/>
+              <w:bottom w:w="90" w:type="dxa"/>
+              <w:left w:w="110" w:type="dxa"/>
+              <w:right w:w="110" w:type="dxa"/>
+            </w:tcMar>
+            <w:shd w:fill="153C52"/>
+          </w:tcPr>
+          <w:p>
+            <w:pPr>
+              <w:spacing w:after="60" w:line="252" w:lineRule="auto"/>
+            </w:pPr>
+            <w:r>
+              <w:rPr>
+                <w:b/>
+                <w:color w:val="FFFFFF"/>
+                <w:sz w:val="20"/>
+              </w:rPr>
+              <w:t>Owner and timing</w:t>
+            </w:r>
+          </w:p>
+        </w:tc>
+        <w:tc>
+          <w:tcPr>
+            <w:tcW w:type="dxa" w:w="4781"/>
+            <w:vAlign w:val="center"/>
+            <w:tcBorders>
+              <w:top w:val="single" w:sz="4" w:color="D9D9D9"/>
+              <w:left w:val="single" w:sz="4" w:color="D9D9D9"/>
+              <w:bottom w:val="single" w:sz="4" w:color="D9D9D9"/>
+              <w:right w:val="single" w:sz="4" w:color="D9D9D9"/>
+            </w:tcBorders>
+            <w:tcMar>
+              <w:top w:w="90" w:type="dxa"/>
+              <w:bottom w:w="90" w:type="dxa"/>
+              <w:left w:w="110" w:type="dxa"/>
+              <w:right w:w="110" w:type="dxa"/>
+            </w:tcMar>
+            <w:shd w:fill="153C52"/>
+          </w:tcPr>
+          <w:p>
+            <w:pPr>
+              <w:spacing w:after="60" w:line="252" w:lineRule="auto"/>
+            </w:pPr>
+            <w:r>
+              <w:rPr>
+                <w:b/>
+                <w:color w:val="FFFFFF"/>
+                <w:sz w:val="20"/>
+              </w:rPr>
+              <w:t>Dependencies and completion</w:t>
+            </w:r>
+          </w:p>
+        </w:tc>
+      </w:tr>
+      <w:tr>
+        <w:trPr>
+          <w:cantSplit/>
+        </w:trPr>
+        <w:tc>
+          <w:tcPr>
+            <w:tcW w:type="dxa" w:w="3240"/>
+            <w:vAlign w:val="center"/>
+            <w:tcBorders>
+              <w:top w:val="single" w:sz="4" w:color="D9D9D9"/>
+              <w:left w:val="single" w:sz="4" w:color="D9D9D9"/>
+              <w:bottom w:val="single" w:sz="4" w:color="D9D9D9"/>
+              <w:right w:val="single" w:sz="4" w:color="D9D9D9"/>
+            </w:tcBorders>
+            <w:tcMar>
+              <w:top w:w="90" w:type="dxa"/>
+              <w:bottom w:w="90" w:type="dxa"/>
+              <w:left w:w="110" w:type="dxa"/>
+              <w:right w:w="110" w:type="dxa"/>
+            </w:tcMar>
+            <w:shd w:fill="F1F6F8"/>
+          </w:tcPr>
+          <w:p>
+            <w:pPr>
+              <w:spacing w:after="60" w:line="252" w:lineRule="auto"/>
+            </w:pPr>
+            <w:r>
+              <w:rPr>
+                <w:b/>
+                <w:sz w:val="20"/>
+              </w:rPr>
+              <w:t>A13 Complete buying follow up</w:t>
+              <w:br/>
+              <w:t>Review evaluation evidence with the sponsor and budget owner; record paid, declined or pending status.</w:t>
+            </w:r>
+          </w:p>
+        </w:tc>
+        <w:tc>
+          <w:tcPr>
+            <w:tcW w:type="dxa" w:w="1872"/>
+            <w:vAlign w:val="center"/>
+            <w:tcBorders>
+              <w:top w:val="single" w:sz="4" w:color="D9D9D9"/>
+              <w:left w:val="single" w:sz="4" w:color="D9D9D9"/>
+              <w:bottom w:val="single" w:sz="4" w:color="D9D9D9"/>
+              <w:right w:val="single" w:sz="4" w:color="D9D9D9"/>
+            </w:tcBorders>
+            <w:tcMar>
+              <w:top w:w="90" w:type="dxa"/>
+              <w:bottom w:w="90" w:type="dxa"/>
+              <w:left w:w="110" w:type="dxa"/>
+              <w:right w:w="110" w:type="dxa"/>
+            </w:tcMar>
+            <w:shd w:fill="F1F6F8"/>
+          </w:tcPr>
+          <w:p>
+            <w:pPr>
+              <w:spacing w:after="60" w:line="252" w:lineRule="auto"/>
+            </w:pPr>
+            <w:r>
+              <w:rPr>
+                <w:sz w:val="20"/>
+              </w:rPr>
+              <w:t>Sales</w:t>
+              <w:br/>
+              <w:t>Days 46 to 60 or the agreed decision date</w:t>
+            </w:r>
+          </w:p>
+        </w:tc>
+        <w:tc>
+          <w:tcPr>
+            <w:tcW w:type="dxa" w:w="4781"/>
+            <w:vAlign w:val="center"/>
+            <w:tcBorders>
+              <w:top w:val="single" w:sz="4" w:color="D9D9D9"/>
+              <w:left w:val="single" w:sz="4" w:color="D9D9D9"/>
+              <w:bottom w:val="single" w:sz="4" w:color="D9D9D9"/>
+              <w:right w:val="single" w:sz="4" w:color="D9D9D9"/>
+            </w:tcBorders>
+            <w:tcMar>
+              <w:top w:w="90" w:type="dxa"/>
+              <w:bottom w:w="90" w:type="dxa"/>
+              <w:left w:w="110" w:type="dxa"/>
+              <w:right w:w="110" w:type="dxa"/>
+            </w:tcMar>
+            <w:shd w:fill="F1F6F8"/>
+          </w:tcPr>
+          <w:p>
+            <w:pPr>
+              <w:spacing w:after="60" w:line="252" w:lineRule="auto"/>
+            </w:pPr>
+            <w:r>
+              <w:rPr>
+                <w:sz w:val="20"/>
+              </w:rPr>
+              <w:t>Dependency: agreed evaluation outcome and buyer approval path.</w:t>
+              <w:br/>
+              <w:t>Done: terms, billing and handoff are confirmed for paid accounts; pending decisions keep a reason and next date.</w:t>
+            </w:r>
+          </w:p>
+        </w:tc>
+      </w:tr>
+      <w:tr>
+        <w:trPr>
+          <w:cantSplit/>
+        </w:trPr>
+        <w:tc>
+          <w:tcPr>
+            <w:tcW w:type="dxa" w:w="3240"/>
+            <w:vAlign w:val="center"/>
+            <w:tcBorders>
+              <w:top w:val="single" w:sz="4" w:color="D9D9D9"/>
+              <w:left w:val="single" w:sz="4" w:color="D9D9D9"/>
+              <w:bottom w:val="single" w:sz="4" w:color="D9D9D9"/>
+              <w:right w:val="single" w:sz="4" w:color="D9D9D9"/>
+            </w:tcBorders>
+            <w:tcMar>
+              <w:top w:w="90" w:type="dxa"/>
+              <w:bottom w:w="90" w:type="dxa"/>
+              <w:left w:w="110" w:type="dxa"/>
+              <w:right w:w="110" w:type="dxa"/>
+            </w:tcMar>
+            <w:shd w:fill="FFFFFF"/>
+          </w:tcPr>
+          <w:p>
+            <w:pPr>
+              <w:spacing w:after="60" w:line="252" w:lineRule="auto"/>
+            </w:pPr>
+            <w:r>
+              <w:rPr>
+                <w:b/>
+                <w:sz w:val="20"/>
+              </w:rPr>
+              <w:t>A14 Review lost and stalled accounts</w:t>
+              <w:br/>
+              <w:t>Produce a dated decision log of objections, blockers and alternative explanations.</w:t>
+            </w:r>
+          </w:p>
+        </w:tc>
+        <w:tc>
+          <w:tcPr>
+            <w:tcW w:type="dxa" w:w="1872"/>
+            <w:vAlign w:val="center"/>
+            <w:tcBorders>
+              <w:top w:val="single" w:sz="4" w:color="D9D9D9"/>
+              <w:left w:val="single" w:sz="4" w:color="D9D9D9"/>
+              <w:bottom w:val="single" w:sz="4" w:color="D9D9D9"/>
+              <w:right w:val="single" w:sz="4" w:color="D9D9D9"/>
+            </w:tcBorders>
+            <w:tcMar>
+              <w:top w:w="90" w:type="dxa"/>
+              <w:bottom w:w="90" w:type="dxa"/>
+              <w:left w:w="110" w:type="dxa"/>
+              <w:right w:w="110" w:type="dxa"/>
+            </w:tcMar>
+            <w:shd w:fill="FFFFFF"/>
+          </w:tcPr>
+          <w:p>
+            <w:pPr>
+              <w:spacing w:after="60" w:line="252" w:lineRule="auto"/>
+            </w:pPr>
+            <w:r>
+              <w:rPr>
+                <w:sz w:val="20"/>
+              </w:rPr>
+              <w:t>PM with sales</w:t>
+              <w:br/>
+              <w:t>Days 46 to 65</w:t>
+            </w:r>
+          </w:p>
+        </w:tc>
+        <w:tc>
+          <w:tcPr>
+            <w:tcW w:type="dxa" w:w="4781"/>
+            <w:vAlign w:val="center"/>
+            <w:tcBorders>
+              <w:top w:val="single" w:sz="4" w:color="D9D9D9"/>
+              <w:left w:val="single" w:sz="4" w:color="D9D9D9"/>
+              <w:bottom w:val="single" w:sz="4" w:color="D9D9D9"/>
+              <w:right w:val="single" w:sz="4" w:color="D9D9D9"/>
+            </w:tcBorders>
+            <w:tcMar>
+              <w:top w:w="90" w:type="dxa"/>
+              <w:bottom w:w="90" w:type="dxa"/>
+              <w:left w:w="110" w:type="dxa"/>
+              <w:right w:w="110" w:type="dxa"/>
+            </w:tcMar>
+            <w:shd w:fill="FFFFFF"/>
+          </w:tcPr>
+          <w:p>
+            <w:pPr>
+              <w:spacing w:after="60" w:line="252" w:lineRule="auto"/>
+            </w:pPr>
+            <w:r>
+              <w:rPr>
+                <w:sz w:val="20"/>
+              </w:rPr>
+              <w:t>Dependency: A9 to A13 records and direct feedback where available.</w:t>
+              <w:br/>
+              <w:t>Done: distinguish poor fit, integration needs, missing proof and budget timing; avoid treating every loss as a feature request.</w:t>
+            </w:r>
+          </w:p>
+        </w:tc>
+      </w:tr>
+      <w:tr>
+        <w:trPr>
+          <w:cantSplit/>
+        </w:trPr>
+        <w:tc>
+          <w:tcPr>
+            <w:tcW w:type="dxa" w:w="3240"/>
+            <w:vAlign w:val="center"/>
+            <w:tcBorders>
+              <w:top w:val="single" w:sz="4" w:color="D9D9D9"/>
+              <w:left w:val="single" w:sz="4" w:color="D9D9D9"/>
+              <w:bottom w:val="single" w:sz="4" w:color="D9D9D9"/>
+              <w:right w:val="single" w:sz="4" w:color="D9D9D9"/>
+            </w:tcBorders>
+            <w:tcMar>
+              <w:top w:w="90" w:type="dxa"/>
+              <w:bottom w:w="90" w:type="dxa"/>
+              <w:left w:w="110" w:type="dxa"/>
+              <w:right w:w="110" w:type="dxa"/>
+            </w:tcMar>
+            <w:shd w:fill="F1F6F8"/>
+          </w:tcPr>
+          <w:p>
+            <w:pPr>
+              <w:spacing w:after="60" w:line="252" w:lineRule="auto"/>
+            </w:pPr>
+            <w:r>
+              <w:rPr>
+                <w:b/>
+                <w:sz w:val="20"/>
+              </w:rPr>
+              <w:t>A15 Follow repeat use and support</w:t>
+              <w:br/>
+              <w:t>Review recurring requests, unused accounts and service effort. See Sections 8 and 11.</w:t>
+            </w:r>
+          </w:p>
+        </w:tc>
+        <w:tc>
+          <w:tcPr>
+            <w:tcW w:type="dxa" w:w="1872"/>
+            <w:vAlign w:val="center"/>
+            <w:tcBorders>
+              <w:top w:val="single" w:sz="4" w:color="D9D9D9"/>
+              <w:left w:val="single" w:sz="4" w:color="D9D9D9"/>
+              <w:bottom w:val="single" w:sz="4" w:color="D9D9D9"/>
+              <w:right w:val="single" w:sz="4" w:color="D9D9D9"/>
+            </w:tcBorders>
+            <w:tcMar>
+              <w:top w:w="90" w:type="dxa"/>
+              <w:bottom w:w="90" w:type="dxa"/>
+              <w:left w:w="110" w:type="dxa"/>
+              <w:right w:w="110" w:type="dxa"/>
+            </w:tcMar>
+            <w:shd w:fill="F1F6F8"/>
+          </w:tcPr>
+          <w:p>
+            <w:pPr>
+              <w:spacing w:after="60" w:line="252" w:lineRule="auto"/>
+            </w:pPr>
+            <w:r>
+              <w:rPr>
+                <w:sz w:val="20"/>
+              </w:rPr>
+              <w:t>Customer success</w:t>
+              <w:br/>
+              <w:t>Days 46 to 90</w:t>
+            </w:r>
+          </w:p>
+        </w:tc>
+        <w:tc>
+          <w:tcPr>
+            <w:tcW w:type="dxa" w:w="4781"/>
+            <w:vAlign w:val="center"/>
+            <w:tcBorders>
+              <w:top w:val="single" w:sz="4" w:color="D9D9D9"/>
+              <w:left w:val="single" w:sz="4" w:color="D9D9D9"/>
+              <w:bottom w:val="single" w:sz="4" w:color="D9D9D9"/>
+              <w:right w:val="single" w:sz="4" w:color="D9D9D9"/>
+            </w:tcBorders>
+            <w:tcMar>
+              <w:top w:w="90" w:type="dxa"/>
+              <w:bottom w:w="90" w:type="dxa"/>
+              <w:left w:w="110" w:type="dxa"/>
+              <w:right w:w="110" w:type="dxa"/>
+            </w:tcMar>
+            <w:shd w:fill="F1F6F8"/>
+          </w:tcPr>
+          <w:p>
+            <w:pPr>
+              <w:spacing w:after="60" w:line="252" w:lineRule="auto"/>
+            </w:pPr>
+            <w:r>
+              <w:rPr>
+                <w:sz w:val="20"/>
+              </w:rPr>
+              <w:t>Dependency: first live value and an agreed follow up window.</w:t>
+              <w:br/>
+              <w:t>Done: record repeated use or its absence, unresolved issues and staff hours; name the next intervention and owner.</w:t>
+            </w:r>
+          </w:p>
+        </w:tc>
+      </w:tr>
+      <w:tr>
+        <w:trPr>
+          <w:cantSplit/>
+        </w:trPr>
+        <w:tc>
+          <w:tcPr>
+            <w:tcW w:type="dxa" w:w="3240"/>
+            <w:vAlign w:val="center"/>
+            <w:tcBorders>
+              <w:top w:val="single" w:sz="4" w:color="D9D9D9"/>
+              <w:left w:val="single" w:sz="4" w:color="D9D9D9"/>
+              <w:bottom w:val="single" w:sz="4" w:color="D9D9D9"/>
+              <w:right w:val="single" w:sz="4" w:color="D9D9D9"/>
+            </w:tcBorders>
+            <w:tcMar>
+              <w:top w:w="90" w:type="dxa"/>
+              <w:bottom w:w="90" w:type="dxa"/>
+              <w:left w:w="110" w:type="dxa"/>
+              <w:right w:w="110" w:type="dxa"/>
+            </w:tcMar>
+            <w:shd w:fill="FFFFFF"/>
+          </w:tcPr>
+          <w:p>
+            <w:pPr>
+              <w:spacing w:after="60" w:line="252" w:lineRule="auto"/>
+            </w:pPr>
+            <w:r>
+              <w:rPr>
+                <w:b/>
+                <w:sz w:val="20"/>
+              </w:rPr>
+              <w:t>A16 Revise assets and enablement</w:t>
+              <w:br/>
+              <w:t>Update offer copy, FAQs, qualification rules and the demo when evidence changes.</w:t>
+            </w:r>
+          </w:p>
+        </w:tc>
+        <w:tc>
+          <w:tcPr>
+            <w:tcW w:type="dxa" w:w="1872"/>
+            <w:vAlign w:val="center"/>
+            <w:tcBorders>
+              <w:top w:val="single" w:sz="4" w:color="D9D9D9"/>
+              <w:left w:val="single" w:sz="4" w:color="D9D9D9"/>
+              <w:bottom w:val="single" w:sz="4" w:color="D9D9D9"/>
+              <w:right w:val="single" w:sz="4" w:color="D9D9D9"/>
+            </w:tcBorders>
+            <w:tcMar>
+              <w:top w:w="90" w:type="dxa"/>
+              <w:bottom w:w="90" w:type="dxa"/>
+              <w:left w:w="110" w:type="dxa"/>
+              <w:right w:w="110" w:type="dxa"/>
+            </w:tcMar>
+            <w:shd w:fill="FFFFFF"/>
+          </w:tcPr>
+          <w:p>
+            <w:pPr>
+              <w:spacing w:after="60" w:line="252" w:lineRule="auto"/>
+            </w:pPr>
+            <w:r>
+              <w:rPr>
+                <w:sz w:val="20"/>
+              </w:rPr>
+              <w:t>Product marketing with PM</w:t>
+              <w:br/>
+              <w:t>Days 60 to 75</w:t>
+            </w:r>
+          </w:p>
+        </w:tc>
+        <w:tc>
+          <w:tcPr>
+            <w:tcW w:type="dxa" w:w="4781"/>
+            <w:vAlign w:val="center"/>
+            <w:tcBorders>
+              <w:top w:val="single" w:sz="4" w:color="D9D9D9"/>
+              <w:left w:val="single" w:sz="4" w:color="D9D9D9"/>
+              <w:bottom w:val="single" w:sz="4" w:color="D9D9D9"/>
+              <w:right w:val="single" w:sz="4" w:color="D9D9D9"/>
+            </w:tcBorders>
+            <w:tcMar>
+              <w:top w:w="90" w:type="dxa"/>
+              <w:bottom w:w="90" w:type="dxa"/>
+              <w:left w:w="110" w:type="dxa"/>
+              <w:right w:w="110" w:type="dxa"/>
+            </w:tcMar>
+            <w:shd w:fill="FFFFFF"/>
+          </w:tcPr>
+          <w:p>
+            <w:pPr>
+              <w:spacing w:after="60" w:line="252" w:lineRule="auto"/>
+            </w:pPr>
+            <w:r>
+              <w:rPr>
+                <w:sz w:val="20"/>
+              </w:rPr>
+              <w:t>Dependency: A14 and A15 findings.</w:t>
+              <w:br/>
+              <w:t>Done: replace changed claims in every live asset; brief sales and delivery; record the version and approver.</w:t>
+            </w:r>
+          </w:p>
+        </w:tc>
+      </w:tr>
+      <w:tr>
+        <w:trPr>
+          <w:cantSplit/>
+        </w:trPr>
+        <w:tc>
+          <w:tcPr>
+            <w:tcW w:type="dxa" w:w="3240"/>
+            <w:vAlign w:val="center"/>
+            <w:tcBorders>
+              <w:top w:val="single" w:sz="4" w:color="D9D9D9"/>
+              <w:left w:val="single" w:sz="4" w:color="D9D9D9"/>
+              <w:bottom w:val="single" w:sz="4" w:color="D9D9D9"/>
+              <w:right w:val="single" w:sz="4" w:color="D9D9D9"/>
+            </w:tcBorders>
+            <w:tcMar>
+              <w:top w:w="90" w:type="dxa"/>
+              <w:bottom w:w="90" w:type="dxa"/>
+              <w:left w:w="110" w:type="dxa"/>
+              <w:right w:w="110" w:type="dxa"/>
+            </w:tcMar>
+            <w:shd w:fill="F1F6F8"/>
+          </w:tcPr>
+          <w:p>
+            <w:pPr>
+              <w:spacing w:after="60" w:line="252" w:lineRule="auto"/>
+            </w:pPr>
+            <w:r>
+              <w:rPr>
+                <w:b/>
+                <w:sz w:val="20"/>
+              </w:rPr>
+              <w:t>A17 Decide the next launch investment</w:t>
+              <w:br/>
+              <w:t>Produce a cohort review and a revised activity plan. See Sections 6, 11 and 12.</w:t>
+            </w:r>
+          </w:p>
+        </w:tc>
+        <w:tc>
+          <w:tcPr>
+            <w:tcW w:type="dxa" w:w="1872"/>
+            <w:vAlign w:val="center"/>
+            <w:tcBorders>
+              <w:top w:val="single" w:sz="4" w:color="D9D9D9"/>
+              <w:left w:val="single" w:sz="4" w:color="D9D9D9"/>
+              <w:bottom w:val="single" w:sz="4" w:color="D9D9D9"/>
+              <w:right w:val="single" w:sz="4" w:color="D9D9D9"/>
+            </w:tcBorders>
+            <w:tcMar>
+              <w:top w:w="90" w:type="dxa"/>
+              <w:bottom w:w="90" w:type="dxa"/>
+              <w:left w:w="110" w:type="dxa"/>
+              <w:right w:w="110" w:type="dxa"/>
+            </w:tcMar>
+            <w:shd w:fill="F1F6F8"/>
+          </w:tcPr>
+          <w:p>
+            <w:pPr>
+              <w:spacing w:after="60" w:line="252" w:lineRule="auto"/>
+            </w:pPr>
+            <w:r>
+              <w:rPr>
+                <w:sz w:val="20"/>
+              </w:rPr>
+              <w:t>GTM owner</w:t>
+              <w:br/>
+              <w:t>By day 90</w:t>
+            </w:r>
+          </w:p>
+        </w:tc>
+        <w:tc>
+          <w:tcPr>
+            <w:tcW w:type="dxa" w:w="4781"/>
+            <w:vAlign w:val="center"/>
+            <w:tcBorders>
+              <w:top w:val="single" w:sz="4" w:color="D9D9D9"/>
+              <w:left w:val="single" w:sz="4" w:color="D9D9D9"/>
+              <w:bottom w:val="single" w:sz="4" w:color="D9D9D9"/>
+              <w:right w:val="single" w:sz="4" w:color="D9D9D9"/>
+            </w:tcBorders>
+            <w:tcMar>
+              <w:top w:w="90" w:type="dxa"/>
+              <w:bottom w:w="90" w:type="dxa"/>
+              <w:left w:w="110" w:type="dxa"/>
+              <w:right w:w="110" w:type="dxa"/>
+            </w:tcMar>
+            <w:shd w:fill="F1F6F8"/>
+          </w:tcPr>
+          <w:p>
+            <w:pPr>
+              <w:spacing w:after="60" w:line="252" w:lineRule="auto"/>
+            </w:pPr>
+            <w:r>
+              <w:rPr>
+                <w:sz w:val="20"/>
+              </w:rPr>
+              <w:t>Dependency: mature outcome data and delivery costs.</w:t>
+              <w:br/>
+              <w:t>Done: compare paid adoption, setup effort and support capacity with the declared decision rule; approve, revise or stop further spend.</w:t>
+            </w:r>
+          </w:p>
+        </w:tc>
+      </w:tr>
+    </w:tbl>
+    <w:p>
+      <w:pPr>
+        <w:widowControl/>
+        <w:spacing w:after="0"/>
+      </w:pPr>
+    </w:p>
+    <w:p>
+      <w:pPr>
+        <w:pStyle w:val="Heading2"/>
+      </w:pPr>
+      <w:r>
+        <w:t>Gate to the next stage</w:t>
+      </w:r>
+    </w:p>
+    <w:p>
+      <w:pPr>
+        <w:widowControl/>
+      </w:pPr>
+      <w:r>
+        <w:t>Scale only after the defined customer outcome, paid demand and delivery effort support expansion. An inconclusive small cohort should lead to another scoped test, with a recorded budget and capacity limit.</w:t>
+      </w:r>
+    </w:p>
+    <w:p>
+      <w:r>
+        <w:br w:type="page"/>
+      </w:r>
+    </w:p>
+    <w:p>
+      <w:pPr>
+        <w:pStyle w:val="Heading1"/>
+      </w:pPr>
+      <w:r>
+        <w:t>Reusable GTM activity record</w:t>
+      </w:r>
+    </w:p>
+    <w:p>
+      <w:pPr>
+        <w:widowControl/>
+      </w:pPr>
+      <w:r>
+        <w:t>Duplicate this record for each activity in your plan. Give every record a unique ID and link predecessor IDs so a delayed dependency changes the next start date. Replace proposed roles with named owners before execution.</w:t>
+      </w:r>
+    </w:p>
+    <w:tbl>
+      <w:tblPr>
+        <w:tblW w:type="auto" w:w="0"/>
+        <w:jc w:val="center"/>
+        <w:tblLayout w:type="fixed"/>
+        <w:tblLook w:firstColumn="1" w:firstRow="1" w:lastColumn="0" w:lastRow="0" w:noHBand="0" w:noVBand="1" w:val="04A0"/>
+      </w:tblPr>
+      <w:tblGrid>
+        <w:gridCol w:w="2448"/>
+        <w:gridCol w:w="7445"/>
+      </w:tblGrid>
+      <w:tr>
+        <w:trPr>
+          <w:cantSplit/>
+          <w:tblHeader/>
+        </w:trPr>
+        <w:tc>
+          <w:tcPr>
+            <w:tcW w:type="dxa" w:w="2448"/>
+            <w:vAlign w:val="center"/>
+            <w:tcBorders>
+              <w:top w:val="single" w:sz="4" w:color="D9D9D9"/>
+              <w:left w:val="single" w:sz="4" w:color="D9D9D9"/>
+              <w:bottom w:val="single" w:sz="4" w:color="D9D9D9"/>
+              <w:right w:val="single" w:sz="4" w:color="D9D9D9"/>
+            </w:tcBorders>
+            <w:tcMar>
+              <w:top w:w="90" w:type="dxa"/>
+              <w:bottom w:w="90" w:type="dxa"/>
+              <w:left w:w="110" w:type="dxa"/>
+              <w:right w:w="110" w:type="dxa"/>
+            </w:tcMar>
+            <w:shd w:fill="153C52"/>
+          </w:tcPr>
+          <w:p>
+            <w:pPr>
+              <w:spacing w:after="60" w:line="252" w:lineRule="auto"/>
+            </w:pPr>
+            <w:r>
+              <w:rPr>
+                <w:b/>
+                <w:color w:val="FFFFFF"/>
+                <w:sz w:val="20"/>
+              </w:rPr>
+              <w:t>Decision</w:t>
+            </w:r>
+          </w:p>
+        </w:tc>
+        <w:tc>
+          <w:tcPr>
+            <w:tcW w:type="dxa" w:w="7445"/>
+            <w:vAlign w:val="center"/>
+            <w:tcBorders>
+              <w:top w:val="single" w:sz="4" w:color="D9D9D9"/>
+              <w:left w:val="single" w:sz="4" w:color="D9D9D9"/>
+              <w:bottom w:val="single" w:sz="4" w:color="D9D9D9"/>
+              <w:right w:val="single" w:sz="4" w:color="D9D9D9"/>
+            </w:tcBorders>
+            <w:tcMar>
+              <w:top w:w="90" w:type="dxa"/>
+              <w:bottom w:w="90" w:type="dxa"/>
+              <w:left w:w="110" w:type="dxa"/>
+              <w:right w:w="110" w:type="dxa"/>
+            </w:tcMar>
+            <w:shd w:fill="153C52"/>
+          </w:tcPr>
+          <w:p>
+            <w:pPr>
+              <w:spacing w:after="60" w:line="252" w:lineRule="auto"/>
+            </w:pPr>
+            <w:r>
+              <w:rPr>
+                <w:b/>
+                <w:color w:val="FFFFFF"/>
+                <w:sz w:val="20"/>
+              </w:rPr>
+              <w:t>Your answer and evidence</w:t>
+            </w:r>
+          </w:p>
+        </w:tc>
+      </w:tr>
+      <w:tr>
+        <w:trPr>
+          <w:cantSplit/>
+        </w:trPr>
+        <w:tc>
+          <w:tcPr>
+            <w:tcW w:type="dxa" w:w="2448"/>
+            <w:vAlign w:val="center"/>
+            <w:tcBorders>
+              <w:top w:val="single" w:sz="4" w:color="D9D9D9"/>
+              <w:left w:val="single" w:sz="4" w:color="D9D9D9"/>
+              <w:bottom w:val="single" w:sz="4" w:color="D9D9D9"/>
+              <w:right w:val="single" w:sz="4" w:color="D9D9D9"/>
+            </w:tcBorders>
+            <w:tcMar>
+              <w:top w:w="90" w:type="dxa"/>
+              <w:bottom w:w="90" w:type="dxa"/>
+              <w:left w:w="110" w:type="dxa"/>
+              <w:right w:w="110" w:type="dxa"/>
+            </w:tcMar>
+            <w:shd w:fill="F1F6F8"/>
+          </w:tcPr>
+          <w:p>
+            <w:pPr>
+              <w:spacing w:after="60" w:line="252" w:lineRule="auto"/>
+            </w:pPr>
+            <w:r>
+              <w:rPr>
+                <w:b/>
+                <w:sz w:val="20"/>
+              </w:rPr>
+              <w:t>Activity and decision</w:t>
+            </w:r>
+          </w:p>
+        </w:tc>
+        <w:tc>
+          <w:tcPr>
+            <w:tcW w:type="dxa" w:w="7445"/>
+            <w:vAlign w:val="center"/>
+            <w:tcBorders>
+              <w:top w:val="single" w:sz="4" w:color="D9D9D9"/>
+              <w:left w:val="single" w:sz="4" w:color="D9D9D9"/>
+              <w:bottom w:val="single" w:sz="4" w:color="D9D9D9"/>
+              <w:right w:val="single" w:sz="4" w:color="D9D9D9"/>
+            </w:tcBorders>
+            <w:tcMar>
+              <w:top w:w="90" w:type="dxa"/>
+              <w:bottom w:w="90" w:type="dxa"/>
+              <w:left w:w="110" w:type="dxa"/>
+              <w:right w:w="110" w:type="dxa"/>
+            </w:tcMar>
+            <w:shd w:fill="F1F6F8"/>
+          </w:tcPr>
+          <w:p>
+            <w:pPr>
+              <w:spacing w:after="60" w:line="252" w:lineRule="auto"/>
+            </w:pPr>
+            <w:r>
+              <w:rPr>
+                <w:i/>
+                <w:color w:val="52616B"/>
+                <w:sz w:val="20"/>
+              </w:rPr>
+              <w:t>[ID, action, purpose, audience and supporting GTM section.]</w:t>
+            </w:r>
+            <w:r>
+              <w:rPr>
+                <w:i w:val="0"/>
+                <w:color w:val="20252B"/>
+                <w:sz w:val="20"/>
+              </w:rPr>
+              <w:br/>
+              <w:t xml:space="preserve">Your response: </w:t>
+            </w:r>
+          </w:p>
+        </w:tc>
+      </w:tr>
+      <w:tr>
+        <w:trPr>
+          <w:cantSplit/>
+        </w:trPr>
+        <w:tc>
+          <w:tcPr>
+            <w:tcW w:type="dxa" w:w="2448"/>
+            <w:vAlign w:val="center"/>
+            <w:tcBorders>
+              <w:top w:val="single" w:sz="4" w:color="D9D9D9"/>
+              <w:left w:val="single" w:sz="4" w:color="D9D9D9"/>
+              <w:bottom w:val="single" w:sz="4" w:color="D9D9D9"/>
+              <w:right w:val="single" w:sz="4" w:color="D9D9D9"/>
+            </w:tcBorders>
+            <w:tcMar>
+              <w:top w:w="90" w:type="dxa"/>
+              <w:bottom w:w="90" w:type="dxa"/>
+              <w:left w:w="110" w:type="dxa"/>
+              <w:right w:w="110" w:type="dxa"/>
+            </w:tcMar>
+            <w:shd w:fill="FFFFFF"/>
+          </w:tcPr>
+          <w:p>
+            <w:pPr>
+              <w:spacing w:after="60" w:line="252" w:lineRule="auto"/>
+            </w:pPr>
+            <w:r>
+              <w:rPr>
+                <w:b/>
+                <w:sz w:val="20"/>
+              </w:rPr>
+              <w:t>Output and location</w:t>
+            </w:r>
+          </w:p>
+        </w:tc>
+        <w:tc>
+          <w:tcPr>
+            <w:tcW w:type="dxa" w:w="7445"/>
+            <w:vAlign w:val="center"/>
+            <w:tcBorders>
+              <w:top w:val="single" w:sz="4" w:color="D9D9D9"/>
+              <w:left w:val="single" w:sz="4" w:color="D9D9D9"/>
+              <w:bottom w:val="single" w:sz="4" w:color="D9D9D9"/>
+              <w:right w:val="single" w:sz="4" w:color="D9D9D9"/>
+            </w:tcBorders>
+            <w:tcMar>
+              <w:top w:w="90" w:type="dxa"/>
+              <w:bottom w:w="90" w:type="dxa"/>
+              <w:left w:w="110" w:type="dxa"/>
+              <w:right w:w="110" w:type="dxa"/>
+            </w:tcMar>
+            <w:shd w:fill="FFFFFF"/>
+          </w:tcPr>
+          <w:p>
+            <w:pPr>
+              <w:spacing w:after="60" w:line="252" w:lineRule="auto"/>
+            </w:pPr>
+            <w:r>
+              <w:rPr>
+                <w:i/>
+                <w:color w:val="52616B"/>
+                <w:sz w:val="20"/>
+              </w:rPr>
+              <w:t>[Specific deliverable and link to the working or finished asset.]</w:t>
+            </w:r>
+            <w:r>
+              <w:rPr>
+                <w:i w:val="0"/>
+                <w:color w:val="20252B"/>
+                <w:sz w:val="20"/>
+              </w:rPr>
+              <w:br/>
+              <w:t xml:space="preserve">Your response: </w:t>
+            </w:r>
+          </w:p>
+        </w:tc>
+      </w:tr>
+      <w:tr>
+        <w:trPr>
+          <w:cantSplit/>
+        </w:trPr>
+        <w:tc>
+          <w:tcPr>
+            <w:tcW w:type="dxa" w:w="2448"/>
+            <w:vAlign w:val="center"/>
+            <w:tcBorders>
+              <w:top w:val="single" w:sz="4" w:color="D9D9D9"/>
+              <w:left w:val="single" w:sz="4" w:color="D9D9D9"/>
+              <w:bottom w:val="single" w:sz="4" w:color="D9D9D9"/>
+              <w:right w:val="single" w:sz="4" w:color="D9D9D9"/>
+            </w:tcBorders>
+            <w:tcMar>
+              <w:top w:w="90" w:type="dxa"/>
+              <w:bottom w:w="90" w:type="dxa"/>
+              <w:left w:w="110" w:type="dxa"/>
+              <w:right w:w="110" w:type="dxa"/>
+            </w:tcMar>
+            <w:shd w:fill="F1F6F8"/>
+          </w:tcPr>
+          <w:p>
+            <w:pPr>
+              <w:spacing w:after="60" w:line="252" w:lineRule="auto"/>
+            </w:pPr>
+            <w:r>
+              <w:rPr>
+                <w:b/>
+                <w:sz w:val="20"/>
+              </w:rPr>
+              <w:t>Owner and approver</w:t>
+            </w:r>
+          </w:p>
+        </w:tc>
+        <w:tc>
+          <w:tcPr>
+            <w:tcW w:type="dxa" w:w="7445"/>
+            <w:vAlign w:val="center"/>
+            <w:tcBorders>
+              <w:top w:val="single" w:sz="4" w:color="D9D9D9"/>
+              <w:left w:val="single" w:sz="4" w:color="D9D9D9"/>
+              <w:bottom w:val="single" w:sz="4" w:color="D9D9D9"/>
+              <w:right w:val="single" w:sz="4" w:color="D9D9D9"/>
+            </w:tcBorders>
+            <w:tcMar>
+              <w:top w:w="90" w:type="dxa"/>
+              <w:bottom w:w="90" w:type="dxa"/>
+              <w:left w:w="110" w:type="dxa"/>
+              <w:right w:w="110" w:type="dxa"/>
+            </w:tcMar>
+            <w:shd w:fill="F1F6F8"/>
+          </w:tcPr>
+          <w:p>
+            <w:pPr>
+              <w:spacing w:after="60" w:line="252" w:lineRule="auto"/>
+            </w:pPr>
+            <w:r>
+              <w:rPr>
+                <w:i/>
+                <w:color w:val="52616B"/>
+                <w:sz w:val="20"/>
+              </w:rPr>
+              <w:t>[One accountable owner, contributors and required approver.]</w:t>
+            </w:r>
+            <w:r>
+              <w:rPr>
+                <w:i w:val="0"/>
+                <w:color w:val="20252B"/>
+                <w:sz w:val="20"/>
+              </w:rPr>
+              <w:br/>
+              <w:t xml:space="preserve">Your response: </w:t>
+            </w:r>
+          </w:p>
+        </w:tc>
+      </w:tr>
+      <w:tr>
+        <w:trPr>
+          <w:cantSplit/>
+        </w:trPr>
+        <w:tc>
+          <w:tcPr>
+            <w:tcW w:type="dxa" w:w="2448"/>
+            <w:vAlign w:val="center"/>
+            <w:tcBorders>
+              <w:top w:val="single" w:sz="4" w:color="D9D9D9"/>
+              <w:left w:val="single" w:sz="4" w:color="D9D9D9"/>
+              <w:bottom w:val="single" w:sz="4" w:color="D9D9D9"/>
+              <w:right w:val="single" w:sz="4" w:color="D9D9D9"/>
+            </w:tcBorders>
+            <w:tcMar>
+              <w:top w:w="90" w:type="dxa"/>
+              <w:bottom w:w="90" w:type="dxa"/>
+              <w:left w:w="110" w:type="dxa"/>
+              <w:right w:w="110" w:type="dxa"/>
+            </w:tcMar>
+            <w:shd w:fill="FFFFFF"/>
+          </w:tcPr>
+          <w:p>
+            <w:pPr>
+              <w:spacing w:after="60" w:line="252" w:lineRule="auto"/>
+            </w:pPr>
+            <w:r>
+              <w:rPr>
+                <w:b/>
+                <w:sz w:val="20"/>
+              </w:rPr>
+              <w:t>Timing and dependencies</w:t>
+            </w:r>
+          </w:p>
+        </w:tc>
+        <w:tc>
+          <w:tcPr>
+            <w:tcW w:type="dxa" w:w="7445"/>
+            <w:vAlign w:val="center"/>
+            <w:tcBorders>
+              <w:top w:val="single" w:sz="4" w:color="D9D9D9"/>
+              <w:left w:val="single" w:sz="4" w:color="D9D9D9"/>
+              <w:bottom w:val="single" w:sz="4" w:color="D9D9D9"/>
+              <w:right w:val="single" w:sz="4" w:color="D9D9D9"/>
+            </w:tcBorders>
+            <w:tcMar>
+              <w:top w:w="90" w:type="dxa"/>
+              <w:bottom w:w="90" w:type="dxa"/>
+              <w:left w:w="110" w:type="dxa"/>
+              <w:right w:w="110" w:type="dxa"/>
+            </w:tcMar>
+            <w:shd w:fill="FFFFFF"/>
+          </w:tcPr>
+          <w:p>
+            <w:pPr>
+              <w:spacing w:after="60" w:line="252" w:lineRule="auto"/>
+            </w:pPr>
+            <w:r>
+              <w:rPr>
+                <w:i/>
+                <w:color w:val="52616B"/>
+                <w:sz w:val="20"/>
+              </w:rPr>
+              <w:t>[Start, due date, predecessor IDs and condition that permits work to begin.]</w:t>
+            </w:r>
+            <w:r>
+              <w:rPr>
+                <w:i w:val="0"/>
+                <w:color w:val="20252B"/>
+                <w:sz w:val="20"/>
+              </w:rPr>
+              <w:br/>
+              <w:t xml:space="preserve">Your response: </w:t>
+            </w:r>
+          </w:p>
+        </w:tc>
+      </w:tr>
+      <w:tr>
+        <w:trPr>
+          <w:cantSplit/>
+        </w:trPr>
+        <w:tc>
+          <w:tcPr>
+            <w:tcW w:type="dxa" w:w="2448"/>
+            <w:vAlign w:val="center"/>
+            <w:tcBorders>
+              <w:top w:val="single" w:sz="4" w:color="D9D9D9"/>
+              <w:left w:val="single" w:sz="4" w:color="D9D9D9"/>
+              <w:bottom w:val="single" w:sz="4" w:color="D9D9D9"/>
+              <w:right w:val="single" w:sz="4" w:color="D9D9D9"/>
+            </w:tcBorders>
+            <w:tcMar>
+              <w:top w:w="90" w:type="dxa"/>
+              <w:bottom w:w="90" w:type="dxa"/>
+              <w:left w:w="110" w:type="dxa"/>
+              <w:right w:w="110" w:type="dxa"/>
+            </w:tcMar>
+            <w:shd w:fill="F1F6F8"/>
+          </w:tcPr>
+          <w:p>
+            <w:pPr>
+              <w:spacing w:after="60" w:line="252" w:lineRule="auto"/>
+            </w:pPr>
+            <w:r>
+              <w:rPr>
+                <w:b/>
+                <w:sz w:val="20"/>
+              </w:rPr>
+              <w:t>Resources and completion</w:t>
+            </w:r>
+          </w:p>
+        </w:tc>
+        <w:tc>
+          <w:tcPr>
+            <w:tcW w:type="dxa" w:w="7445"/>
+            <w:vAlign w:val="center"/>
+            <w:tcBorders>
+              <w:top w:val="single" w:sz="4" w:color="D9D9D9"/>
+              <w:left w:val="single" w:sz="4" w:color="D9D9D9"/>
+              <w:bottom w:val="single" w:sz="4" w:color="D9D9D9"/>
+              <w:right w:val="single" w:sz="4" w:color="D9D9D9"/>
+            </w:tcBorders>
+            <w:tcMar>
+              <w:top w:w="90" w:type="dxa"/>
+              <w:bottom w:w="90" w:type="dxa"/>
+              <w:left w:w="110" w:type="dxa"/>
+              <w:right w:w="110" w:type="dxa"/>
+            </w:tcMar>
+            <w:shd w:fill="F1F6F8"/>
+          </w:tcPr>
+          <w:p>
+            <w:pPr>
+              <w:spacing w:after="60" w:line="252" w:lineRule="auto"/>
+            </w:pPr>
+            <w:r>
+              <w:rPr>
+                <w:i/>
+                <w:color w:val="52616B"/>
+                <w:sz w:val="20"/>
+              </w:rPr>
+              <w:t>[Staff hours, spend cap and test or evidence required to accept the output.]</w:t>
+            </w:r>
+            <w:r>
+              <w:rPr>
+                <w:i w:val="0"/>
+                <w:color w:val="20252B"/>
+                <w:sz w:val="20"/>
+              </w:rPr>
+              <w:br/>
+              <w:t xml:space="preserve">Your response: </w:t>
+            </w:r>
+          </w:p>
+        </w:tc>
+      </w:tr>
+      <w:tr>
+        <w:trPr>
+          <w:cantSplit/>
+        </w:trPr>
+        <w:tc>
+          <w:tcPr>
+            <w:tcW w:type="dxa" w:w="2448"/>
+            <w:vAlign w:val="center"/>
+            <w:tcBorders>
+              <w:top w:val="single" w:sz="4" w:color="D9D9D9"/>
+              <w:left w:val="single" w:sz="4" w:color="D9D9D9"/>
+              <w:bottom w:val="single" w:sz="4" w:color="D9D9D9"/>
+              <w:right w:val="single" w:sz="4" w:color="D9D9D9"/>
+            </w:tcBorders>
+            <w:tcMar>
+              <w:top w:w="90" w:type="dxa"/>
+              <w:bottom w:w="90" w:type="dxa"/>
+              <w:left w:w="110" w:type="dxa"/>
+              <w:right w:w="110" w:type="dxa"/>
+            </w:tcMar>
+            <w:shd w:fill="FFFFFF"/>
+          </w:tcPr>
+          <w:p>
+            <w:pPr>
+              <w:spacing w:after="60" w:line="252" w:lineRule="auto"/>
+            </w:pPr>
+            <w:r>
+              <w:rPr>
+                <w:b/>
+                <w:sz w:val="20"/>
+              </w:rPr>
+              <w:t>Outcome and next review</w:t>
+            </w:r>
+          </w:p>
+        </w:tc>
+        <w:tc>
+          <w:tcPr>
+            <w:tcW w:type="dxa" w:w="7445"/>
+            <w:vAlign w:val="center"/>
+            <w:tcBorders>
+              <w:top w:val="single" w:sz="4" w:color="D9D9D9"/>
+              <w:left w:val="single" w:sz="4" w:color="D9D9D9"/>
+              <w:bottom w:val="single" w:sz="4" w:color="D9D9D9"/>
+              <w:right w:val="single" w:sz="4" w:color="D9D9D9"/>
+            </w:tcBorders>
+            <w:tcMar>
+              <w:top w:w="90" w:type="dxa"/>
+              <w:bottom w:w="90" w:type="dxa"/>
+              <w:left w:w="110" w:type="dxa"/>
+              <w:right w:w="110" w:type="dxa"/>
+            </w:tcMar>
+            <w:shd w:fill="FFFFFF"/>
+          </w:tcPr>
+          <w:p>
+            <w:pPr>
+              <w:spacing w:after="60" w:line="252" w:lineRule="auto"/>
+            </w:pPr>
+            <w:r>
+              <w:rPr>
+                <w:i/>
+                <w:color w:val="52616B"/>
+                <w:sz w:val="20"/>
+              </w:rPr>
+              <w:t>[Measure, eligible accounts, observation window, review date and continue or stop rule.]</w:t>
+            </w:r>
+            <w:r>
+              <w:rPr>
+                <w:i w:val="0"/>
+                <w:color w:val="20252B"/>
+                <w:sz w:val="20"/>
+              </w:rPr>
+              <w:br/>
+              <w:t xml:space="preserve">Your response: </w:t>
+            </w:r>
+          </w:p>
+        </w:tc>
+      </w:tr>
+      <w:tr>
+        <w:trPr>
+          <w:cantSplit/>
+        </w:trPr>
+        <w:tc>
+          <w:tcPr>
+            <w:tcW w:type="dxa" w:w="2448"/>
+            <w:vAlign w:val="center"/>
+            <w:tcBorders>
+              <w:top w:val="single" w:sz="4" w:color="D9D9D9"/>
+              <w:left w:val="single" w:sz="4" w:color="D9D9D9"/>
+              <w:bottom w:val="single" w:sz="4" w:color="D9D9D9"/>
+              <w:right w:val="single" w:sz="4" w:color="D9D9D9"/>
+            </w:tcBorders>
+            <w:tcMar>
+              <w:top w:w="90" w:type="dxa"/>
+              <w:bottom w:w="90" w:type="dxa"/>
+              <w:left w:w="110" w:type="dxa"/>
+              <w:right w:w="110" w:type="dxa"/>
+            </w:tcMar>
+            <w:shd w:fill="F1F6F8"/>
+          </w:tcPr>
+          <w:p>
+            <w:pPr>
+              <w:spacing w:after="60" w:line="252" w:lineRule="auto"/>
+            </w:pPr>
+            <w:r>
+              <w:rPr>
+                <w:b/>
+                <w:sz w:val="20"/>
+              </w:rPr>
+              <w:t>Status and blocker</w:t>
+            </w:r>
+          </w:p>
+        </w:tc>
+        <w:tc>
+          <w:tcPr>
+            <w:tcW w:type="dxa" w:w="7445"/>
+            <w:vAlign w:val="center"/>
+            <w:tcBorders>
+              <w:top w:val="single" w:sz="4" w:color="D9D9D9"/>
+              <w:left w:val="single" w:sz="4" w:color="D9D9D9"/>
+              <w:bottom w:val="single" w:sz="4" w:color="D9D9D9"/>
+              <w:right w:val="single" w:sz="4" w:color="D9D9D9"/>
+            </w:tcBorders>
+            <w:tcMar>
+              <w:top w:w="90" w:type="dxa"/>
+              <w:bottom w:w="90" w:type="dxa"/>
+              <w:left w:w="110" w:type="dxa"/>
+              <w:right w:w="110" w:type="dxa"/>
+            </w:tcMar>
+            <w:shd w:fill="F1F6F8"/>
+          </w:tcPr>
+          <w:p>
+            <w:pPr>
+              <w:spacing w:after="60" w:line="252" w:lineRule="auto"/>
+            </w:pPr>
+            <w:r>
+              <w:rPr>
+                <w:i/>
+                <w:color w:val="52616B"/>
+                <w:sz w:val="20"/>
+              </w:rPr>
+              <w:t>[Planned, in progress, blocked, ready for review, done or stopped; blocker, resolution owner and next date.]</w:t>
+            </w:r>
+            <w:r>
+              <w:rPr>
+                <w:i w:val="0"/>
+                <w:color w:val="20252B"/>
+                <w:sz w:val="20"/>
+              </w:rPr>
+              <w:br/>
+              <w:t xml:space="preserve">Your response: </w:t>
+            </w:r>
+          </w:p>
+        </w:tc>
+      </w:tr>
+    </w:tbl>
+    <w:p>
+      <w:pPr>
+        <w:widowControl/>
+        <w:spacing w:after="0"/>
+      </w:pPr>
+    </w:p>
+    <w:p>
+      <w:pPr>
+        <w:pStyle w:val="Heading2"/>
+      </w:pPr>
+      <w:r>
+        <w:t>Activity register and weekly review</w:t>
+      </w:r>
+    </w:p>
+    <w:p>
+      <w:pPr>
+        <w:widowControl/>
+      </w:pPr>
+      <w:r>
+        <w:t>Keep the records together as an activity register. Review the next gate, overdue dependencies and unfinished customer handoffs each week. Move a record to done only when its output passes the acceptance condition and has an accessible link. Outcome evidence can mature later; keep its review date open.</w:t>
+      </w:r>
+    </w:p>
+    <w:p>
+      <w:pPr>
+        <w:widowControl/>
+      </w:pPr>
+      <w:r>
+        <w:t>For example, A8 can be complete when the webinar ran and interested accounts were handed off. Whether that webinar justified further spending is reviewed later using qualified evaluations, paid adoption and delivery effort. Count both the completed output and the commercial result.</w:t>
+      </w:r>
+    </w:p>
+    <w:p>
+      <w:r>
+        <w:br w:type="page"/>
+      </w:r>
+    </w:p>
+    <w:p>
+      <w:pPr>
+        <w:pStyle w:val="Heading1"/>
+      </w:pPr>
+      <w:r>
+        <w:t>14 One page GTM brief</w:t>
       </w:r>
     </w:p>
     <w:p>
@@ -8627,7 +12159,7 @@
                 <w:b/>
                 <w:sz w:val="20"/>
               </w:rPr>
-              <w:t>Measurement and ownership</w:t>
+              <w:t>Execution and next milestone</w:t>
             </w:r>
           </w:p>
         </w:tc>
@@ -8648,6 +12180,72 @@
               <w:right w:w="110" w:type="dxa"/>
             </w:tcMar>
             <w:shd w:fill="FFFFFF"/>
+          </w:tcPr>
+          <w:p>
+            <w:pPr>
+              <w:spacing w:after="60" w:line="252" w:lineRule="auto"/>
+            </w:pPr>
+            <w:r>
+              <w:rPr>
+                <w:sz w:val="20"/>
+              </w:rPr>
+              <w:t>[Critical activities, owners, due dates, dependencies and next gate; link to the activity register.]</w:t>
+            </w:r>
+          </w:p>
+        </w:tc>
+      </w:tr>
+      <w:tr>
+        <w:trPr>
+          <w:cantSplit/>
+        </w:trPr>
+        <w:tc>
+          <w:tcPr>
+            <w:tcW w:type="dxa" w:w="2448"/>
+            <w:vAlign w:val="center"/>
+            <w:tcBorders>
+              <w:top w:val="single" w:sz="4" w:color="D9D9D9"/>
+              <w:left w:val="single" w:sz="4" w:color="D9D9D9"/>
+              <w:bottom w:val="single" w:sz="4" w:color="D9D9D9"/>
+              <w:right w:val="single" w:sz="4" w:color="D9D9D9"/>
+            </w:tcBorders>
+            <w:tcMar>
+              <w:top w:w="90" w:type="dxa"/>
+              <w:bottom w:w="90" w:type="dxa"/>
+              <w:left w:w="110" w:type="dxa"/>
+              <w:right w:w="110" w:type="dxa"/>
+            </w:tcMar>
+            <w:shd w:fill="F1F6F8"/>
+          </w:tcPr>
+          <w:p>
+            <w:pPr>
+              <w:spacing w:after="60" w:line="252" w:lineRule="auto"/>
+            </w:pPr>
+            <w:r>
+              <w:rPr>
+                <w:b/>
+                <w:sz w:val="20"/>
+              </w:rPr>
+              <w:t>Measurement and ownership</w:t>
+            </w:r>
+          </w:p>
+        </w:tc>
+        <w:tc>
+          <w:tcPr>
+            <w:tcW w:type="dxa" w:w="7445"/>
+            <w:vAlign w:val="center"/>
+            <w:tcBorders>
+              <w:top w:val="single" w:sz="4" w:color="D9D9D9"/>
+              <w:left w:val="single" w:sz="4" w:color="D9D9D9"/>
+              <w:bottom w:val="single" w:sz="4" w:color="D9D9D9"/>
+              <w:right w:val="single" w:sz="4" w:color="D9D9D9"/>
+            </w:tcBorders>
+            <w:tcMar>
+              <w:top w:w="90" w:type="dxa"/>
+              <w:bottom w:w="90" w:type="dxa"/>
+              <w:left w:w="110" w:type="dxa"/>
+              <w:right w:w="110" w:type="dxa"/>
+            </w:tcMar>
+            <w:shd w:fill="F1F6F8"/>
           </w:tcPr>
           <w:p>
             <w:pPr>
@@ -9660,7 +13258,7 @@
     </w:pPr>
     <w:rPr>
       <w:rFonts w:ascii="Arial" w:hAnsi="Arial"/>
-      <w:color w:val="20252B"/>
+      <w:color w:val="000000"/>
       <w:sz w:val="21"/>
     </w:rPr>
   </w:style>
@@ -9726,7 +13324,7 @@
       <w:rFonts w:asciiTheme="majorHAnsi" w:eastAsiaTheme="majorEastAsia" w:hAnsiTheme="majorHAnsi" w:cstheme="majorBidi" w:ascii="Arial" w:hAnsi="Arial"/>
       <w:b/>
       <w:bCs/>
-      <w:color w:val="153C52"/>
+      <w:color w:val="000000"/>
       <w:sz w:val="40"/>
       <w:szCs w:val="28"/>
     </w:rPr>
@@ -9750,7 +13348,7 @@
       <w:rFonts w:asciiTheme="majorHAnsi" w:eastAsiaTheme="majorEastAsia" w:hAnsiTheme="majorHAnsi" w:cstheme="majorBidi" w:ascii="Arial" w:hAnsi="Arial"/>
       <w:b/>
       <w:bCs/>
-      <w:color w:val="20252B"/>
+      <w:color w:val="000000"/>
       <w:sz w:val="23"/>
       <w:szCs w:val="26"/>
     </w:rPr>
@@ -9774,7 +13372,7 @@
       <w:rFonts w:asciiTheme="majorHAnsi" w:eastAsiaTheme="majorEastAsia" w:hAnsiTheme="majorHAnsi" w:cstheme="majorBidi" w:ascii="Arial" w:hAnsi="Arial"/>
       <w:b/>
       <w:bCs/>
-      <w:color w:val="20252B"/>
+      <w:color w:val="000000"/>
     </w:rPr>
   </w:style>
   <w:style w:type="paragraph" w:styleId="Heading4">
@@ -10050,7 +13648,7 @@
       <w:rFonts w:asciiTheme="majorHAnsi" w:eastAsiaTheme="majorEastAsia" w:hAnsiTheme="majorHAnsi" w:cstheme="majorBidi" w:ascii="Arial" w:hAnsi="Arial"/>
       <w:i/>
       <w:iCs/>
-      <w:color w:val="20252B"/>
+      <w:color w:val="000000"/>
       <w:spacing w:val="15"/>
       <w:sz w:val="26"/>
       <w:szCs w:val="24"/>

</xml_diff>